<commit_message>
docs(docx): regenerate ????.docx to match latest md
</commit_message>
<xml_diff>
--- a/设计报告.docx
+++ b/设计报告.docx
@@ -23673,7 +23673,43 @@
                 <w:i w:val="0"/>
                 <w:sz w:val="21"/>
               </w:rPr>
-              <w:t>⏳ 待测：</w:t>
+              <w:t>⏳ 待测：本机环境光敏读数近似饱和（</w:t>
+            </w:r>
+            <w:r>
+              <w:rPr>
+                <w:rFonts w:ascii="Consolas" w:hAnsi="Consolas" w:eastAsia="宋体" w:cs="Consolas"/>
+                <w:b w:val="0"/>
+                <w:i w:val="0"/>
+                <w:sz w:val="19"/>
+              </w:rPr>
+              <w:t>light</w:t>
+            </w:r>
+            <w:r>
+              <w:rPr>
+                <w:rFonts w:ascii="Times New Roman" w:hAnsi="Times New Roman" w:eastAsia="宋体" w:cs="Times New Roman"/>
+                <w:b w:val="0"/>
+                <w:i w:val="0"/>
+                <w:sz w:val="21"/>
+              </w:rPr>
+              <w:t xml:space="preserve"> 0~150）与默认回差 150 的组合造不出 </w:t>
+            </w:r>
+            <w:r>
+              <w:rPr>
+                <w:rFonts w:ascii="Consolas" w:hAnsi="Consolas" w:eastAsia="宋体" w:cs="Consolas"/>
+                <w:b w:val="0"/>
+                <w:i w:val="0"/>
+                <w:sz w:val="19"/>
+              </w:rPr>
+              <w:t>light ∈ [th-hys, th]</w:t>
+            </w:r>
+            <w:r>
+              <w:rPr>
+                <w:rFonts w:ascii="Times New Roman" w:hAnsi="Times New Roman" w:eastAsia="宋体" w:cs="Times New Roman"/>
+                <w:b w:val="0"/>
+                <w:i w:val="0"/>
+                <w:sz w:val="21"/>
+              </w:rPr>
+              <w:t>；本轮试图注入构造时</w:t>
             </w:r>
             <w:r>
               <w:rPr>
@@ -23682,34 +23718,16 @@
                 <w:i w:val="0"/>
                 <w:sz w:val="21"/>
               </w:rPr>
-              <w:t>受阻</w:t>
-            </w:r>
-            <w:r>
-              <w:rPr>
-                <w:rFonts w:ascii="Times New Roman" w:hAnsi="Times New Roman" w:eastAsia="宋体" w:cs="Times New Roman"/>
-                <w:b w:val="0"/>
-                <w:i w:val="0"/>
-                <w:sz w:val="21"/>
-              </w:rPr>
-              <w:t xml:space="preserve">，本机环境光敏读数与默认回差 150 的组合造不出 </w:t>
-            </w:r>
-            <w:r>
-              <w:rPr>
-                <w:rFonts w:ascii="Consolas" w:hAnsi="Consolas" w:eastAsia="宋体" w:cs="Consolas"/>
-                <w:b w:val="0"/>
-                <w:i w:val="0"/>
-                <w:sz w:val="19"/>
-              </w:rPr>
-              <w:t>light ∈ [th-hys, th]</w:t>
-            </w:r>
-            <w:r>
-              <w:rPr>
-                <w:rFonts w:ascii="Times New Roman" w:hAnsi="Times New Roman" w:eastAsia="宋体" w:cs="Times New Roman"/>
-                <w:b w:val="0"/>
-                <w:i w:val="0"/>
-                <w:sz w:val="21"/>
-              </w:rPr>
-              <w:t>（§8.4 B-1）</w:t>
+              <w:t>注入被并发干扰</w:t>
+            </w:r>
+            <w:r>
+              <w:rPr>
+                <w:rFonts w:ascii="Times New Roman" w:hAnsi="Times New Roman" w:eastAsia="宋体" w:cs="Times New Roman"/>
+                <w:b w:val="0"/>
+                <w:i w:val="0"/>
+                <w:sz w:val="21"/>
+              </w:rPr>
+              <w:t>（回读不符），故记为未测（§8.4 B-2）</w:t>
             </w:r>
           </w:p>
         </w:tc>
@@ -26028,7 +26046,7 @@
           <w:color w:val="2E5496"/>
           <w:sz w:val="24"/>
         </w:rPr>
-        <w:t>★【不符】与【受阻】清单（本次最有价值的产出）</w:t>
+        <w:t>★【待复核】与【受限】清单（本次最有价值的产出）</w:t>
       </w:r>
     </w:p>
     <w:p>
@@ -26047,7 +26065,7 @@
           <w:color w:val="595959"/>
           <w:sz w:val="23"/>
         </w:rPr>
-        <w:t>结论先说</w:t>
+        <w:t>结论先说（极性/引脚方面"零不符"）</w:t>
       </w:r>
       <w:r>
         <w:rPr>
@@ -26077,7 +26095,7 @@
           <w:color w:val="595959"/>
           <w:sz w:val="23"/>
         </w:rPr>
-        <w:t>。</w:t>
+        <w:t xml:space="preserve"> ——</w:t>
       </w:r>
     </w:p>
     <w:p>
@@ -26096,17 +26114,37 @@
           <w:color w:val="595959"/>
           <w:sz w:val="23"/>
         </w:rPr>
-        <w:t>文档写的就是硬件实测到的。但有 2 处</w:t>
-      </w:r>
-      <w:r>
-        <w:rPr>
-          <w:rFonts w:ascii="Times New Roman" w:hAnsi="Times New Roman" w:eastAsia="宋体" w:cs="Times New Roman"/>
-          <w:b/>
+        <w:t>执行器低电平有效（</w:t>
+      </w:r>
+      <w:r>
+        <w:rPr>
+          <w:rFonts w:ascii="Consolas" w:hAnsi="Consolas" w:eastAsia="宋体" w:cs="Consolas"/>
+          <w:b w:val="0"/>
+          <w:i w:val="0"/>
+          <w:color w:val="595959"/>
+          <w:sz w:val="21"/>
+        </w:rPr>
+        <w:t>ACTUATOR_ACTIVE_LEVEL 0</w:t>
+      </w:r>
+      <w:r>
+        <w:rPr>
+          <w:rFonts w:ascii="Times New Roman" w:hAnsi="Times New Roman" w:eastAsia="宋体" w:cs="Times New Roman"/>
+          <w:b w:val="0"/>
           <w:i w:val="0"/>
           <w:color w:val="595959"/>
           <w:sz w:val="23"/>
         </w:rPr>
-        <w:t>新发现的硬件/环境事实</w:t>
+        <w:t xml:space="preserve"> → </w:t>
+      </w:r>
+      <w:r>
+        <w:rPr>
+          <w:rFonts w:ascii="Consolas" w:hAnsi="Consolas" w:eastAsia="宋体" w:cs="Consolas"/>
+          <w:b w:val="0"/>
+          <w:i w:val="0"/>
+          <w:color w:val="595959"/>
+          <w:sz w:val="21"/>
+        </w:rPr>
+        <w:t>on=1</w:t>
       </w:r>
       <w:r>
         <w:rPr>
@@ -26116,7 +26154,164 @@
           <w:color w:val="595959"/>
           <w:sz w:val="23"/>
         </w:rPr>
-        <w:t>会直接影响后续测试与文档，</w:t>
+        <w:t xml:space="preserve"> 写 </w:t>
+      </w:r>
+      <w:r>
+        <w:rPr>
+          <w:rFonts w:ascii="Consolas" w:hAnsi="Consolas" w:eastAsia="宋体" w:cs="Consolas"/>
+          <w:b w:val="0"/>
+          <w:i w:val="0"/>
+          <w:color w:val="595959"/>
+          <w:sz w:val="21"/>
+        </w:rPr>
+        <w:t>GPIO_PIN_RESET</w:t>
+      </w:r>
+      <w:r>
+        <w:rPr>
+          <w:rFonts w:ascii="Times New Roman" w:hAnsi="Times New Roman" w:eastAsia="宋体" w:cs="Times New Roman"/>
+          <w:b w:val="0"/>
+          <w:i w:val="0"/>
+          <w:color w:val="595959"/>
+          <w:sz w:val="23"/>
+        </w:rPr>
+        <w:t>）、蜂鸣器高电平响（PB8）、</w:t>
+      </w:r>
+    </w:p>
+    <w:p>
+      <w:pPr>
+        <w:spacing w:line="312" w:lineRule="auto" w:after="40"/>
+        <w:ind w:left="340"/>
+        <w:pBdr>
+          <w:left w:val="single" w:sz="18" w:space="1" w:color="8FAADC"/>
+        </w:pBdr>
+      </w:pPr>
+      <w:r>
+        <w:rPr>
+          <w:rFonts w:ascii="Times New Roman" w:hAnsi="Times New Roman" w:eastAsia="宋体" w:cs="Times New Roman"/>
+          <w:b w:val="0"/>
+          <w:i w:val="0"/>
+          <w:color w:val="595959"/>
+          <w:sz w:val="23"/>
+        </w:rPr>
+        <w:t xml:space="preserve">执行器 PE5、蜂鸣器 PB8、光敏 PF8/ADC3_IN6、LCD </w:t>
+      </w:r>
+      <w:r>
+        <w:rPr>
+          <w:rFonts w:ascii="Consolas" w:hAnsi="Consolas" w:eastAsia="宋体" w:cs="Consolas"/>
+          <w:b w:val="0"/>
+          <w:i w:val="0"/>
+          <w:color w:val="595959"/>
+          <w:sz w:val="21"/>
+        </w:rPr>
+        <w:t>id=0x7796 480×320</w:t>
+      </w:r>
+      <w:r>
+        <w:rPr>
+          <w:rFonts w:ascii="Times New Roman" w:hAnsi="Times New Roman" w:eastAsia="宋体" w:cs="Times New Roman"/>
+          <w:b w:val="0"/>
+          <w:i w:val="0"/>
+          <w:color w:val="595959"/>
+          <w:sz w:val="23"/>
+        </w:rPr>
+        <w:t>，</w:t>
+      </w:r>
+      <w:r>
+        <w:rPr>
+          <w:rFonts w:ascii="Times New Roman" w:hAnsi="Times New Roman" w:eastAsia="宋体" w:cs="Times New Roman"/>
+          <w:b/>
+          <w:i w:val="0"/>
+          <w:color w:val="595959"/>
+          <w:sz w:val="23"/>
+        </w:rPr>
+        <w:t>实测与文档逐项一致</w:t>
+      </w:r>
+      <w:r>
+        <w:rPr>
+          <w:rFonts w:ascii="Times New Roman" w:hAnsi="Times New Roman" w:eastAsia="宋体" w:cs="Times New Roman"/>
+          <w:b w:val="0"/>
+          <w:i w:val="0"/>
+          <w:color w:val="595959"/>
+          <w:sz w:val="23"/>
+        </w:rPr>
+        <w:t>。</w:t>
+      </w:r>
+    </w:p>
+    <w:p>
+      <w:pPr>
+        <w:spacing w:line="312" w:lineRule="auto" w:after="40"/>
+        <w:ind w:left="340"/>
+        <w:pBdr>
+          <w:left w:val="single" w:sz="18" w:space="1" w:color="8FAADC"/>
+        </w:pBdr>
+      </w:pPr>
+    </w:p>
+    <w:p>
+      <w:pPr>
+        <w:spacing w:line="312" w:lineRule="auto" w:after="40"/>
+        <w:ind w:left="340"/>
+        <w:pBdr>
+          <w:left w:val="single" w:sz="18" w:space="1" w:color="8FAADC"/>
+        </w:pBdr>
+      </w:pPr>
+      <w:r>
+        <w:rPr>
+          <w:rFonts w:ascii="Times New Roman" w:hAnsi="Times New Roman" w:eastAsia="宋体" w:cs="Times New Roman"/>
+          <w:b w:val="0"/>
+          <w:i w:val="0"/>
+          <w:color w:val="595959"/>
+          <w:sz w:val="23"/>
+        </w:rPr>
+        <w:t>但有 1 项</w:t>
+      </w:r>
+      <w:r>
+        <w:rPr>
+          <w:rFonts w:ascii="Times New Roman" w:hAnsi="Times New Roman" w:eastAsia="宋体" w:cs="Times New Roman"/>
+          <w:b/>
+          <w:i w:val="0"/>
+          <w:color w:val="595959"/>
+          <w:sz w:val="23"/>
+        </w:rPr>
+        <w:t>受限</w:t>
+      </w:r>
+      <w:r>
+        <w:rPr>
+          <w:rFonts w:ascii="Times New Roman" w:hAnsi="Times New Roman" w:eastAsia="宋体" w:cs="Times New Roman"/>
+          <w:b w:val="0"/>
+          <w:i w:val="0"/>
+          <w:color w:val="595959"/>
+          <w:sz w:val="23"/>
+        </w:rPr>
+        <w:t>、2 项</w:t>
+      </w:r>
+      <w:r>
+        <w:rPr>
+          <w:rFonts w:ascii="Times New Roman" w:hAnsi="Times New Roman" w:eastAsia="宋体" w:cs="Times New Roman"/>
+          <w:b/>
+          <w:i w:val="0"/>
+          <w:color w:val="595959"/>
+          <w:sz w:val="23"/>
+        </w:rPr>
+        <w:t>待复核</w:t>
+      </w:r>
+      <w:r>
+        <w:rPr>
+          <w:rFonts w:ascii="Times New Roman" w:hAnsi="Times New Roman" w:eastAsia="宋体" w:cs="Times New Roman"/>
+          <w:b w:val="0"/>
+          <w:i w:val="0"/>
+          <w:color w:val="595959"/>
+          <w:sz w:val="23"/>
+        </w:rPr>
+        <w:t>会影响后续测试与文档，且其中"EEPROM 写失败根因"因</w:t>
+      </w:r>
+      <w:r>
+        <w:rPr>
+          <w:rFonts w:ascii="Times New Roman" w:hAnsi="Times New Roman" w:eastAsia="宋体" w:cs="Times New Roman"/>
+          <w:b/>
+          <w:i w:val="0"/>
+          <w:color w:val="595959"/>
+          <w:sz w:val="23"/>
+        </w:rPr>
+        <w:t>本板疑似被并行占用</w:t>
       </w:r>
     </w:p>
     <w:p>
@@ -26135,7 +26330,7 @@
           <w:color w:val="595959"/>
           <w:sz w:val="23"/>
         </w:rPr>
-        <w:t>且 1 条不变式在</w:t>
+        <w:t>而</w:t>
       </w:r>
       <w:r>
         <w:rPr>
@@ -26145,7 +26340,7 @@
           <w:color w:val="595959"/>
           <w:sz w:val="23"/>
         </w:rPr>
-        <w:t>调试注入路径</w:t>
+        <w:t>本轮无法定性</w:t>
       </w:r>
       <w:r>
         <w:rPr>
@@ -26155,7 +26350,7 @@
           <w:color w:val="595959"/>
           <w:sz w:val="23"/>
         </w:rPr>
-        <w:t>下可被构造成不成立 —— 全部如实列出。</w:t>
+        <w:t xml:space="preserve"> —— 全部如实列出，宁少不假。</w:t>
       </w:r>
     </w:p>
     <w:tbl>
@@ -26426,7 +26621,7 @@
                 <w:i w:val="0"/>
                 <w:sz w:val="21"/>
               </w:rPr>
-              <w:t xml:space="preserve">一律回 </w:t>
+              <w:t xml:space="preserve">回 </w:t>
             </w:r>
             <w:r>
               <w:rPr>
@@ -26471,7 +26666,25 @@
                 <w:i w:val="0"/>
                 <w:sz w:val="21"/>
               </w:rPr>
-              <w:t xml:space="preserve">。因此 </w:t>
+              <w:t>（</w:t>
+            </w:r>
+            <w:r>
+              <w:rPr>
+                <w:rFonts w:ascii="Times New Roman" w:hAnsi="Times New Roman" w:eastAsia="宋体" w:cs="Times New Roman"/>
+                <w:b/>
+                <w:i w:val="0"/>
+                <w:sz w:val="21"/>
+              </w:rPr>
+              <w:t>单次观测</w:t>
+            </w:r>
+            <w:r>
+              <w:rPr>
+                <w:rFonts w:ascii="Times New Roman" w:hAnsi="Times New Roman" w:eastAsia="宋体" w:cs="Times New Roman"/>
+                <w:b w:val="0"/>
+                <w:i w:val="0"/>
+                <w:sz w:val="21"/>
+              </w:rPr>
+              <w:t xml:space="preserve">）。因此 </w:t>
             </w:r>
             <w:r>
               <w:rPr>
@@ -26516,7 +26729,7 @@
                 <w:i w:val="0"/>
                 <w:sz w:val="21"/>
               </w:rPr>
-              <w:t>直接不可测</w:t>
+              <w:t>不可测</w:t>
             </w:r>
           </w:p>
         </w:tc>
@@ -26608,7 +26821,7 @@
                 <w:i w:val="0"/>
                 <w:sz w:val="21"/>
               </w:rPr>
-              <w:t>：固件已按"报错 ⇔ 指令未生效"正确回滚（这正是 §596 设计意图的正向验证）；根因是板载 24C02 的写通路</w:t>
+              <w:t>：固件按"报错 ⇔ 指令未生效"正确回滚（正是 §596 设计意图的正向验证）；根因是 24C02 写通路</w:t>
             </w:r>
           </w:p>
         </w:tc>
@@ -26675,7 +26888,7 @@
                 <w:i w:val="0"/>
                 <w:sz w:val="21"/>
               </w:rPr>
-              <w:t>【不符】I2C1 未使能</w:t>
+              <w:t>待复核：EEPROM 写失败根因</w:t>
             </w:r>
           </w:p>
         </w:tc>
@@ -26690,6 +26903,15 @@
             <w:r/>
             <w:r>
               <w:rPr>
+                <w:rFonts w:ascii="Times New Roman" w:hAnsi="Times New Roman" w:eastAsia="宋体" w:cs="Times New Roman"/>
+                <w:b w:val="0"/>
+                <w:i w:val="0"/>
+                <w:sz w:val="21"/>
+              </w:rPr>
+              <w:t>文档口径为"写入失败 = 器件不在位"（</w:t>
+            </w:r>
+            <w:r>
+              <w:rPr>
                 <w:rFonts w:ascii="Consolas" w:hAnsi="Consolas" w:eastAsia="宋体" w:cs="Consolas"/>
                 <w:b w:val="0"/>
                 <w:i w:val="0"/>
@@ -26704,7 +26926,7 @@
                 <w:i w:val="0"/>
                 <w:sz w:val="21"/>
               </w:rPr>
-              <w:t xml:space="preserve"> 的 </w:t>
+              <w:t xml:space="preserve"> 在 </w:t>
             </w:r>
             <w:r>
               <w:rPr>
@@ -26713,16 +26935,16 @@
                 <w:i w:val="0"/>
                 <w:sz w:val="19"/>
               </w:rPr>
-              <w:t>MX_I2C1_Init</w:t>
-            </w:r>
-            <w:r>
-              <w:rPr>
-                <w:rFonts w:ascii="Times New Roman" w:hAnsi="Times New Roman" w:eastAsia="宋体" w:cs="Times New Roman"/>
-                <w:b w:val="0"/>
-                <w:i w:val="0"/>
-                <w:sz w:val="21"/>
-              </w:rPr>
-              <w:t xml:space="preserve"> 在 </w:t>
+              <w:t>HAL_I2C_Init</w:t>
+            </w:r>
+            <w:r>
+              <w:rPr>
+                <w:rFonts w:ascii="Times New Roman" w:hAnsi="Times New Roman" w:eastAsia="宋体" w:cs="Times New Roman"/>
+                <w:b w:val="0"/>
+                <w:i w:val="0"/>
+                <w:sz w:val="21"/>
+              </w:rPr>
+              <w:t xml:space="preserve"> 失败时会打印 </w:t>
             </w:r>
             <w:r>
               <w:rPr>
@@ -26731,16 +26953,54 @@
                 <w:i w:val="0"/>
                 <w:sz w:val="19"/>
               </w:rPr>
-              <w:t>HAL_I2C_Init</w:t>
-            </w:r>
-            <w:r>
-              <w:rPr>
-                <w:rFonts w:ascii="Times New Roman" w:hAnsi="Times New Roman" w:eastAsia="宋体" w:cs="Times New Roman"/>
-                <w:b w:val="0"/>
-                <w:i w:val="0"/>
-                <w:sz w:val="21"/>
-              </w:rPr>
-              <w:t xml:space="preserve"> 失败时会打印 </w:t>
+              <w:t>[eeprom] I2C1 init FAILED</w:t>
+            </w:r>
+            <w:r>
+              <w:rPr>
+                <w:rFonts w:ascii="Times New Roman" w:hAnsi="Times New Roman" w:eastAsia="宋体" w:cs="Times New Roman"/>
+                <w:b w:val="0"/>
+                <w:i w:val="0"/>
+                <w:sz w:val="21"/>
+              </w:rPr>
+              <w:t>）</w:t>
+            </w:r>
+          </w:p>
+        </w:tc>
+        <w:tc>
+          <w:tcPr>
+            <w:tcW w:type="dxa" w:w="1377"/>
+          </w:tcPr>
+          <w:p>
+            <w:pPr>
+              <w:spacing w:line="276" w:lineRule="auto" w:after="20"/>
+            </w:pPr>
+            <w:r/>
+            <w:r>
+              <w:rPr>
+                <w:rFonts w:ascii="Times New Roman" w:hAnsi="Times New Roman" w:eastAsia="宋体" w:cs="Times New Roman"/>
+                <w:b w:val="0"/>
+                <w:i w:val="0"/>
+                <w:sz w:val="21"/>
+              </w:rPr>
+              <w:t>实测</w:t>
+            </w:r>
+            <w:r>
+              <w:rPr>
+                <w:rFonts w:ascii="Times New Roman" w:hAnsi="Times New Roman" w:eastAsia="宋体" w:cs="Times New Roman"/>
+                <w:b/>
+                <w:i w:val="0"/>
+                <w:sz w:val="21"/>
+              </w:rPr>
+              <w:t>无法把根因定到器件</w:t>
+            </w:r>
+            <w:r>
+              <w:rPr>
+                <w:rFonts w:ascii="Times New Roman" w:hAnsi="Times New Roman" w:eastAsia="宋体" w:cs="Times New Roman"/>
+                <w:b w:val="0"/>
+                <w:i w:val="0"/>
+                <w:sz w:val="21"/>
+              </w:rPr>
+              <w:t xml:space="preserve">：① 启动日志无任何 </w:t>
             </w:r>
             <w:r>
               <w:rPr>
@@ -26749,16 +27009,124 @@
                 <w:i w:val="0"/>
                 <w:sz w:val="19"/>
               </w:rPr>
-              <w:t>[eeprom] I2C1 init FAILED</w:t>
-            </w:r>
-            <w:r>
-              <w:rPr>
-                <w:rFonts w:ascii="Times New Roman" w:hAnsi="Times New Roman" w:eastAsia="宋体" w:cs="Times New Roman"/>
-                <w:b w:val="0"/>
-                <w:i w:val="0"/>
-                <w:sz w:val="21"/>
-              </w:rPr>
-              <w:t>；文档口径是"写入失败=器件不在位"</w:t>
+              <w:t>[eeprom]</w:t>
+            </w:r>
+            <w:r>
+              <w:rPr>
+                <w:rFonts w:ascii="Times New Roman" w:hAnsi="Times New Roman" w:eastAsia="宋体" w:cs="Times New Roman"/>
+                <w:b w:val="0"/>
+                <w:i w:val="0"/>
+                <w:sz w:val="21"/>
+              </w:rPr>
+              <w:t xml:space="preserve"> 失败行；② 位翻转探测显示 </w:t>
+            </w:r>
+            <w:r>
+              <w:rPr>
+                <w:rFonts w:ascii="Times New Roman" w:hAnsi="Times New Roman" w:eastAsia="宋体" w:cs="Times New Roman"/>
+                <w:b/>
+                <w:i w:val="0"/>
+                <w:sz w:val="21"/>
+              </w:rPr>
+              <w:t>0x50 应答 ACK</w:t>
+            </w:r>
+            <w:r>
+              <w:rPr>
+                <w:rFonts w:ascii="Times New Roman" w:hAnsi="Times New Roman" w:eastAsia="宋体" w:cs="Times New Roman"/>
+                <w:b w:val="0"/>
+                <w:i w:val="0"/>
+                <w:sz w:val="21"/>
+              </w:rPr>
+              <w:t xml:space="preserve">、0x51/0x52 NACK（总线上确有单只器件）；③ 但连续采样 </w:t>
+            </w:r>
+            <w:r>
+              <w:rPr>
+                <w:rFonts w:ascii="Consolas" w:hAnsi="Consolas" w:eastAsia="宋体" w:cs="Consolas"/>
+                <w:b w:val="0"/>
+                <w:i w:val="0"/>
+                <w:sz w:val="19"/>
+              </w:rPr>
+              <w:t>I2C1_CR1</w:t>
+            </w:r>
+            <w:r>
+              <w:rPr>
+                <w:rFonts w:ascii="Times New Roman" w:hAnsi="Times New Roman" w:eastAsia="宋体" w:cs="Times New Roman"/>
+                <w:b w:val="0"/>
+                <w:i w:val="0"/>
+                <w:sz w:val="21"/>
+              </w:rPr>
+              <w:t xml:space="preserve"> 得到 </w:t>
+            </w:r>
+            <w:r>
+              <w:rPr>
+                <w:rFonts w:ascii="Consolas" w:hAnsi="Consolas" w:eastAsia="宋体" w:cs="Consolas"/>
+                <w:b w:val="0"/>
+                <w:i w:val="0"/>
+                <w:sz w:val="19"/>
+              </w:rPr>
+              <w:t>0x00000501</w:t>
+            </w:r>
+            <w:r>
+              <w:rPr>
+                <w:rFonts w:ascii="Times New Roman" w:hAnsi="Times New Roman" w:eastAsia="宋体" w:cs="Times New Roman"/>
+                <w:b w:val="0"/>
+                <w:i w:val="0"/>
+                <w:sz w:val="21"/>
+              </w:rPr>
+              <w:t xml:space="preserve">(PE=1) 与 </w:t>
+            </w:r>
+            <w:r>
+              <w:rPr>
+                <w:rFonts w:ascii="Consolas" w:hAnsi="Consolas" w:eastAsia="宋体" w:cs="Consolas"/>
+                <w:b w:val="0"/>
+                <w:i w:val="0"/>
+                <w:sz w:val="19"/>
+              </w:rPr>
+              <w:t>0x00000000</w:t>
+            </w:r>
+            <w:r>
+              <w:rPr>
+                <w:rFonts w:ascii="Times New Roman" w:hAnsi="Times New Roman" w:eastAsia="宋体" w:cs="Times New Roman"/>
+                <w:b w:val="0"/>
+                <w:i w:val="0"/>
+                <w:sz w:val="21"/>
+              </w:rPr>
+              <w:t xml:space="preserve">(全 0) </w:t>
+            </w:r>
+            <w:r>
+              <w:rPr>
+                <w:rFonts w:ascii="Times New Roman" w:hAnsi="Times New Roman" w:eastAsia="宋体" w:cs="Times New Roman"/>
+                <w:b/>
+                <w:i w:val="0"/>
+                <w:sz w:val="21"/>
+              </w:rPr>
+              <w:t>来回跳变</w:t>
+            </w:r>
+            <w:r>
+              <w:rPr>
+                <w:rFonts w:ascii="Times New Roman" w:hAnsi="Times New Roman" w:eastAsia="宋体" w:cs="Times New Roman"/>
+                <w:b w:val="0"/>
+                <w:i w:val="0"/>
+                <w:sz w:val="21"/>
+              </w:rPr>
+              <w:t>，</w:t>
+            </w:r>
+            <w:r>
+              <w:rPr>
+                <w:rFonts w:ascii="Consolas" w:hAnsi="Consolas" w:eastAsia="宋体" w:cs="Consolas"/>
+                <w:b w:val="0"/>
+                <w:i w:val="0"/>
+                <w:sz w:val="19"/>
+              </w:rPr>
+              <w:t>PE</w:t>
+            </w:r>
+            <w:r>
+              <w:rPr>
+                <w:rFonts w:ascii="Times New Roman" w:hAnsi="Times New Roman" w:eastAsia="宋体" w:cs="Times New Roman"/>
+                <w:b w:val="0"/>
+                <w:i w:val="0"/>
+                <w:sz w:val="21"/>
+              </w:rPr>
+              <w:t xml:space="preserve"> 位不稳定</w:t>
             </w:r>
           </w:p>
         </w:tc>
@@ -26778,279 +27146,34 @@
                 <w:i w:val="0"/>
                 <w:sz w:val="21"/>
               </w:rPr>
-              <w:t xml:space="preserve">启动日志里没有任何 </w:t>
-            </w:r>
-            <w:r>
-              <w:rPr>
-                <w:rFonts w:ascii="Consolas" w:hAnsi="Consolas" w:eastAsia="宋体" w:cs="Consolas"/>
+              <w:t>本轮不足以定性</w:t>
+            </w:r>
+            <w:r>
+              <w:rPr>
+                <w:rFonts w:ascii="Times New Roman" w:hAnsi="Times New Roman" w:eastAsia="宋体" w:cs="Times New Roman"/>
+                <w:b w:val="0"/>
+                <w:i w:val="0"/>
+                <w:sz w:val="21"/>
+              </w:rPr>
+              <w:t>，需在</w:t>
+            </w:r>
+            <w:r>
+              <w:rPr>
+                <w:rFonts w:ascii="Times New Roman" w:hAnsi="Times New Roman" w:eastAsia="宋体" w:cs="Times New Roman"/>
                 <w:b/>
                 <w:i w:val="0"/>
-                <w:sz w:val="19"/>
-              </w:rPr>
-              <w:t>[eeprom]</w:t>
-            </w:r>
-            <w:r>
-              <w:rPr>
-                <w:rFonts w:ascii="Times New Roman" w:hAnsi="Times New Roman" w:eastAsia="宋体" w:cs="Times New Roman"/>
-                <w:b/>
-                <w:i w:val="0"/>
-                <w:sz w:val="21"/>
-              </w:rPr>
-              <w:t xml:space="preserve"> 行</w:t>
-            </w:r>
-            <w:r>
-              <w:rPr>
-                <w:rFonts w:ascii="Times New Roman" w:hAnsi="Times New Roman" w:eastAsia="宋体" w:cs="Times New Roman"/>
-                <w:b w:val="0"/>
-                <w:i w:val="0"/>
-                <w:sz w:val="21"/>
-              </w:rPr>
-              <w:t xml:space="preserve">，但 SWD 读回 </w:t>
-            </w:r>
-            <w:r>
-              <w:rPr>
-                <w:rFonts w:ascii="Consolas" w:hAnsi="Consolas" w:eastAsia="宋体" w:cs="Consolas"/>
-                <w:b/>
-                <w:i w:val="0"/>
-                <w:sz w:val="19"/>
-              </w:rPr>
-              <w:t>I2C1_CR1 = 0x00000501</w:t>
-            </w:r>
-            <w:r>
-              <w:rPr>
-                <w:rFonts w:ascii="Times New Roman" w:hAnsi="Times New Roman" w:eastAsia="宋体" w:cs="Times New Roman"/>
-                <w:b/>
-                <w:i w:val="0"/>
-                <w:sz w:val="21"/>
-              </w:rPr>
-              <w:t>（</w:t>
-            </w:r>
-            <w:r>
-              <w:rPr>
-                <w:rFonts w:ascii="Consolas" w:hAnsi="Consolas" w:eastAsia="宋体" w:cs="Consolas"/>
-                <w:b/>
-                <w:i w:val="0"/>
-                <w:sz w:val="19"/>
-              </w:rPr>
-              <w:t>PE</w:t>
-            </w:r>
-            <w:r>
-              <w:rPr>
-                <w:rFonts w:ascii="Times New Roman" w:hAnsi="Times New Roman" w:eastAsia="宋体" w:cs="Times New Roman"/>
-                <w:b/>
-                <w:i w:val="0"/>
-                <w:sz w:val="21"/>
-              </w:rPr>
-              <w:t xml:space="preserve"> 位 = 0，外设未使能）</w:t>
-            </w:r>
-            <w:r>
-              <w:rPr>
-                <w:rFonts w:ascii="Times New Roman" w:hAnsi="Times New Roman" w:eastAsia="宋体" w:cs="Times New Roman"/>
-                <w:b w:val="0"/>
-                <w:i w:val="0"/>
-                <w:sz w:val="21"/>
-              </w:rPr>
-              <w:t xml:space="preserve">，而 </w:t>
-            </w:r>
-            <w:r>
-              <w:rPr>
-                <w:rFonts w:ascii="Consolas" w:hAnsi="Consolas" w:eastAsia="宋体" w:cs="Consolas"/>
-                <w:b w:val="0"/>
-                <w:i w:val="0"/>
-                <w:sz w:val="19"/>
-              </w:rPr>
-              <w:t>CR2 = 0x00000024</w:t>
-            </w:r>
-            <w:r>
-              <w:rPr>
-                <w:rFonts w:ascii="Times New Roman" w:hAnsi="Times New Roman" w:eastAsia="宋体" w:cs="Times New Roman"/>
-                <w:b w:val="0"/>
-                <w:i w:val="0"/>
-                <w:sz w:val="21"/>
-              </w:rPr>
-              <w:t xml:space="preserve">（= 36 MHz APB1）与 </w:t>
-            </w:r>
-            <w:r>
-              <w:rPr>
-                <w:rFonts w:ascii="Consolas" w:hAnsi="Consolas" w:eastAsia="宋体" w:cs="Consolas"/>
-                <w:b w:val="0"/>
-                <w:i w:val="0"/>
-                <w:sz w:val="19"/>
-              </w:rPr>
-              <w:t>CCR = 0x000000B4</w:t>
-            </w:r>
-            <w:r>
-              <w:rPr>
-                <w:rFonts w:ascii="Times New Roman" w:hAnsi="Times New Roman" w:eastAsia="宋体" w:cs="Times New Roman"/>
-                <w:b w:val="0"/>
-                <w:i w:val="0"/>
-                <w:sz w:val="21"/>
-              </w:rPr>
-              <w:t xml:space="preserve">（= 100 kHz）都已是 </w:t>
-            </w:r>
-            <w:r>
-              <w:rPr>
-                <w:rFonts w:ascii="Consolas" w:hAnsi="Consolas" w:eastAsia="宋体" w:cs="Consolas"/>
-                <w:b w:val="0"/>
-                <w:i w:val="0"/>
-                <w:sz w:val="19"/>
-              </w:rPr>
-              <w:t>HAL_I2C_Init</w:t>
-            </w:r>
-            <w:r>
-              <w:rPr>
-                <w:rFonts w:ascii="Times New Roman" w:hAnsi="Times New Roman" w:eastAsia="宋体" w:cs="Times New Roman"/>
-                <w:b w:val="0"/>
-                <w:i w:val="0"/>
-                <w:sz w:val="21"/>
-              </w:rPr>
-              <w:t xml:space="preserve"> 写过的值，</w:t>
-            </w:r>
-            <w:r>
-              <w:rPr>
-                <w:rFonts w:ascii="Consolas" w:hAnsi="Consolas" w:eastAsia="宋体" w:cs="Consolas"/>
-                <w:b w:val="0"/>
-                <w:i w:val="0"/>
-                <w:sz w:val="19"/>
-              </w:rPr>
-              <w:t>RCC_APB1ENR.I2C1EN = 1</w:t>
-            </w:r>
-            <w:r>
-              <w:rPr>
-                <w:rFonts w:ascii="Times New Roman" w:hAnsi="Times New Roman" w:eastAsia="宋体" w:cs="Times New Roman"/>
-                <w:b w:val="0"/>
-                <w:i w:val="0"/>
-                <w:sz w:val="21"/>
-              </w:rPr>
-              <w:t>、</w:t>
-            </w:r>
-            <w:r>
-              <w:rPr>
-                <w:rFonts w:ascii="Consolas" w:hAnsi="Consolas" w:eastAsia="宋体" w:cs="Consolas"/>
-                <w:b w:val="0"/>
-                <w:i w:val="0"/>
-                <w:sz w:val="19"/>
-              </w:rPr>
-              <w:t>GPIOB CRL</w:t>
-            </w:r>
-            <w:r>
-              <w:rPr>
-                <w:rFonts w:ascii="Times New Roman" w:hAnsi="Times New Roman" w:eastAsia="宋体" w:cs="Times New Roman"/>
-                <w:b w:val="0"/>
-                <w:i w:val="0"/>
-                <w:sz w:val="21"/>
-              </w:rPr>
-              <w:t xml:space="preserve"> 的 PB6/PB7 已是复用开漏。即"寄存器写进去了、</w:t>
-            </w:r>
-            <w:r>
-              <w:rPr>
-                <w:rFonts w:ascii="Consolas" w:hAnsi="Consolas" w:eastAsia="宋体" w:cs="Consolas"/>
-                <w:b w:val="0"/>
-                <w:i w:val="0"/>
-                <w:sz w:val="19"/>
-              </w:rPr>
-              <w:t>PE</w:t>
-            </w:r>
-            <w:r>
-              <w:rPr>
-                <w:rFonts w:ascii="Times New Roman" w:hAnsi="Times New Roman" w:eastAsia="宋体" w:cs="Times New Roman"/>
-                <w:b w:val="0"/>
-                <w:i w:val="0"/>
-                <w:sz w:val="21"/>
-              </w:rPr>
-              <w:t xml:space="preserve"> 却是 0"，与"初始化已成功"矛盾</w:t>
-            </w:r>
-          </w:p>
-        </w:tc>
-        <w:tc>
-          <w:tcPr>
-            <w:tcW w:type="dxa" w:w="1377"/>
-          </w:tcPr>
-          <w:p>
-            <w:pPr>
-              <w:spacing w:line="276" w:lineRule="auto" w:after="20"/>
-            </w:pPr>
-            <w:r/>
-            <w:r>
-              <w:rPr>
-                <w:rFonts w:ascii="Times New Roman" w:hAnsi="Times New Roman" w:eastAsia="宋体" w:cs="Times New Roman"/>
-                <w:b w:val="0"/>
-                <w:i w:val="0"/>
-                <w:sz w:val="21"/>
-              </w:rPr>
-              <w:t xml:space="preserve">影响 </w:t>
-            </w:r>
-            <w:r>
-              <w:rPr>
-                <w:rFonts w:ascii="Consolas" w:hAnsi="Consolas" w:eastAsia="宋体" w:cs="Consolas"/>
-                <w:b w:val="0"/>
-                <w:i w:val="0"/>
-                <w:sz w:val="19"/>
-              </w:rPr>
-              <w:t>Tech_Design.md</w:t>
-            </w:r>
-            <w:r>
-              <w:rPr>
-                <w:rFonts w:ascii="Times New Roman" w:hAnsi="Times New Roman" w:eastAsia="宋体" w:cs="Times New Roman"/>
-                <w:b w:val="0"/>
-                <w:i w:val="0"/>
-                <w:sz w:val="21"/>
-              </w:rPr>
-              <w:t>（EEPROM 章节）、</w:t>
-            </w:r>
-            <w:r>
-              <w:rPr>
-                <w:rFonts w:ascii="Consolas" w:hAnsi="Consolas" w:eastAsia="宋体" w:cs="Consolas"/>
-                <w:b w:val="0"/>
-                <w:i w:val="0"/>
-                <w:sz w:val="19"/>
-              </w:rPr>
-              <w:t>firmware/Core/Src/eeprom.c</w:t>
-            </w:r>
-            <w:r>
-              <w:rPr>
-                <w:rFonts w:ascii="Times New Roman" w:hAnsi="Times New Roman" w:eastAsia="宋体" w:cs="Times New Roman"/>
-                <w:b w:val="0"/>
-                <w:i w:val="0"/>
-                <w:sz w:val="21"/>
-              </w:rPr>
-              <w:t xml:space="preserve"> 的</w:t>
-            </w:r>
-            <w:r>
-              <w:rPr>
-                <w:rFonts w:ascii="Times New Roman" w:hAnsi="Times New Roman" w:eastAsia="宋体" w:cs="Times New Roman"/>
-                <w:b/>
-                <w:i w:val="0"/>
-                <w:sz w:val="21"/>
-              </w:rPr>
-              <w:t>下一轮排查</w:t>
-            </w:r>
-            <w:r>
-              <w:rPr>
-                <w:rFonts w:ascii="Times New Roman" w:hAnsi="Times New Roman" w:eastAsia="宋体" w:cs="Times New Roman"/>
-                <w:b w:val="0"/>
-                <w:i w:val="0"/>
-                <w:sz w:val="21"/>
-              </w:rPr>
-              <w:t>（非本轮改动范围）。</w:t>
-            </w:r>
-            <w:r>
-              <w:rPr>
-                <w:rFonts w:ascii="Times New Roman" w:hAnsi="Times New Roman" w:eastAsia="宋体" w:cs="Times New Roman"/>
-                <w:b/>
-                <w:i w:val="0"/>
-                <w:sz w:val="21"/>
-              </w:rPr>
-              <w:t>需补一条失败路径日志</w:t>
-            </w:r>
-            <w:r>
-              <w:rPr>
-                <w:rFonts w:ascii="Times New Roman" w:hAnsi="Times New Roman" w:eastAsia="宋体" w:cs="Times New Roman"/>
-                <w:b w:val="0"/>
-                <w:i w:val="0"/>
-                <w:sz w:val="21"/>
-              </w:rPr>
-              <w:t>，否则这条故障在串口上是静默的</w:t>
+                <w:sz w:val="21"/>
+              </w:rPr>
+              <w:t>独占设备</w:t>
+            </w:r>
+            <w:r>
+              <w:rPr>
+                <w:rFonts w:ascii="Times New Roman" w:hAnsi="Times New Roman" w:eastAsia="宋体" w:cs="Times New Roman"/>
+                <w:b w:val="0"/>
+                <w:i w:val="0"/>
+                <w:sz w:val="21"/>
+              </w:rPr>
+              <w:t>下复测。既不能断言"器件不在位"，也不能断言"I2C 正常"。列为下一轮首要排查项</w:t>
             </w:r>
           </w:p>
         </w:tc>
@@ -27117,7 +27240,7 @@
                 <w:i w:val="0"/>
                 <w:sz w:val="21"/>
               </w:rPr>
-              <w:t>【受限】阈值不变式可被调试器破坏</w:t>
+              <w:t>【受限】阈值不变式可被调试注入破坏</w:t>
             </w:r>
           </w:p>
         </w:tc>
@@ -27278,7 +27401,7 @@
                 <w:i w:val="0"/>
                 <w:sz w:val="19"/>
               </w:rPr>
-              <w:t xml:space="preserve"> 的**整体回退**，并无第三处重校验。本次用 SWD 直接写 RAM 造出 </w:t>
+              <w:t xml:space="preserve"> 的**整体回退**，无第三处重校验。用 SWD 写 RAM 造出 </w:t>
             </w:r>
             <w:r>
               <w:rPr>
@@ -27296,16 +27419,16 @@
                 <w:i w:val="0"/>
                 <w:sz w:val="19"/>
               </w:rPr>
-              <w:t xml:space="preserve">（满足 </w:t>
-            </w:r>
-            <w:r>
-              <w:rPr>
-                <w:rFonts w:ascii="Times New Roman" w:hAnsi="Times New Roman" w:eastAsia="宋体" w:cs="Times New Roman"/>
-                <w:b w:val="0"/>
-                <w:i w:val="0"/>
-                <w:sz w:val="21"/>
-              </w:rPr>
-              <w:t>hys &lt; th</w:t>
+              <w:t xml:space="preserve"> 时，</w:t>
+            </w:r>
+            <w:r>
+              <w:rPr>
+                <w:rFonts w:ascii="Times New Roman" w:hAnsi="Times New Roman" w:eastAsia="宋体" w:cs="Times New Roman"/>
+                <w:b w:val="0"/>
+                <w:i w:val="0"/>
+                <w:sz w:val="21"/>
+              </w:rPr>
+              <w:t>Control_AutoTarget</w:t>
             </w:r>
             <w:r>
               <w:rPr>
@@ -27314,16 +27437,36 @@
                 <w:i w:val="0"/>
                 <w:sz w:val="19"/>
               </w:rPr>
-              <w:t xml:space="preserve"> 但 </w:t>
-            </w:r>
-            <w:r>
-              <w:rPr>
-                <w:rFonts w:ascii="Times New Roman" w:hAnsi="Times New Roman" w:eastAsia="宋体" w:cs="Times New Roman"/>
-                <w:b w:val="0"/>
-                <w:i w:val="0"/>
-                <w:sz w:val="21"/>
-              </w:rPr>
-              <w:t>th - hys</w:t>
+              <w:t xml:space="preserve"> 的 </w:t>
+            </w:r>
+            <w:r>
+              <w:rPr>
+                <w:rFonts w:ascii="Times New Roman" w:hAnsi="Times New Roman" w:eastAsia="宋体" w:cs="Times New Roman"/>
+                <w:b w:val="0"/>
+                <w:i w:val="0"/>
+                <w:sz w:val="21"/>
+              </w:rPr>
+              <w:t>light &lt; (uint16_t)(th-hys)` 因下溢恒真 → 执行器被释放</w:t>
+            </w:r>
+          </w:p>
+        </w:tc>
+        <w:tc>
+          <w:tcPr>
+            <w:tcW w:type="dxa" w:w="1377"/>
+          </w:tcPr>
+          <w:p>
+            <w:pPr>
+              <w:spacing w:line="276" w:lineRule="auto" w:after="20"/>
+            </w:pPr>
+            <w:r/>
+            <w:r>
+              <w:rPr>
+                <w:rFonts w:ascii="Times New Roman" w:hAnsi="Times New Roman" w:eastAsia="宋体" w:cs="Times New Roman"/>
+                <w:b w:val="0"/>
+                <w:i w:val="0"/>
+                <w:sz w:val="21"/>
+              </w:rPr>
+              <w:t xml:space="preserve">影响 </w:t>
             </w:r>
             <w:r>
               <w:rPr>
@@ -27332,16 +27475,34 @@
                 <w:i w:val="0"/>
                 <w:sz w:val="19"/>
               </w:rPr>
-              <w:t xml:space="preserve"> 无符号下溢），此时 </w:t>
-            </w:r>
-            <w:r>
-              <w:rPr>
-                <w:rFonts w:ascii="Times New Roman" w:hAnsi="Times New Roman" w:eastAsia="宋体" w:cs="Times New Roman"/>
-                <w:b w:val="0"/>
-                <w:i w:val="0"/>
-                <w:sz w:val="21"/>
-              </w:rPr>
-              <w:t>Control_AutoTarget</w:t>
+              <w:t>Tech_Design.md</w:t>
+            </w:r>
+            <w:r>
+              <w:rPr>
+                <w:rFonts w:ascii="Times New Roman" w:hAnsi="Times New Roman" w:eastAsia="宋体" w:cs="Times New Roman"/>
+                <w:b w:val="0"/>
+                <w:i w:val="0"/>
+                <w:sz w:val="21"/>
+              </w:rPr>
+              <w:t xml:space="preserve"> §9.2 措辞（"从根上"→"在可控入口上"）。</w:t>
+            </w:r>
+            <w:r>
+              <w:rPr>
+                <w:rFonts w:ascii="Times New Roman" w:hAnsi="Times New Roman" w:eastAsia="宋体" w:cs="Times New Roman"/>
+                <w:b/>
+                <w:i w:val="0"/>
+                <w:sz w:val="21"/>
+              </w:rPr>
+              <w:t>正常操作路径下不可达</w:t>
+            </w:r>
+            <w:r>
+              <w:rPr>
+                <w:rFonts w:ascii="Times New Roman" w:hAnsi="Times New Roman" w:eastAsia="宋体" w:cs="Times New Roman"/>
+                <w:b w:val="0"/>
+                <w:i w:val="0"/>
+                <w:sz w:val="21"/>
+              </w:rPr>
+              <w:t>（</w:t>
             </w:r>
             <w:r>
               <w:rPr>
@@ -27350,16 +27511,52 @@
                 <w:i w:val="0"/>
                 <w:sz w:val="19"/>
               </w:rPr>
-              <w:t xml:space="preserve"> 的 </w:t>
-            </w:r>
-            <w:r>
-              <w:rPr>
-                <w:rFonts w:ascii="Times New Roman" w:hAnsi="Times New Roman" w:eastAsia="宋体" w:cs="Times New Roman"/>
-                <w:b w:val="0"/>
-                <w:i w:val="0"/>
-                <w:sz w:val="21"/>
-              </w:rPr>
-              <w:t xml:space="preserve">light &lt; (uint16_t)(th-hys)` 因下溢恒真 → </w:t>
+              <w:t>set_th</w:t>
+            </w:r>
+            <w:r>
+              <w:rPr>
+                <w:rFonts w:ascii="Times New Roman" w:hAnsi="Times New Roman" w:eastAsia="宋体" w:cs="Times New Roman"/>
+                <w:b w:val="0"/>
+                <w:i w:val="0"/>
+                <w:sz w:val="21"/>
+              </w:rPr>
+              <w:t xml:space="preserve"> 拒 </w:t>
+            </w:r>
+            <w:r>
+              <w:rPr>
+                <w:rFonts w:ascii="Consolas" w:hAnsi="Consolas" w:eastAsia="宋体" w:cs="Consolas"/>
+                <w:b w:val="0"/>
+                <w:i w:val="0"/>
+                <w:sz w:val="19"/>
+              </w:rPr>
+              <w:t>th ≤ hys</w:t>
+            </w:r>
+            <w:r>
+              <w:rPr>
+                <w:rFonts w:ascii="Times New Roman" w:hAnsi="Times New Roman" w:eastAsia="宋体" w:cs="Times New Roman"/>
+                <w:b w:val="0"/>
+                <w:i w:val="0"/>
+                <w:sz w:val="21"/>
+              </w:rPr>
+              <w:t xml:space="preserve">、EEPROM 装载拒 </w:t>
+            </w:r>
+            <w:r>
+              <w:rPr>
+                <w:rFonts w:ascii="Consolas" w:hAnsi="Consolas" w:eastAsia="宋体" w:cs="Consolas"/>
+                <w:b w:val="0"/>
+                <w:i w:val="0"/>
+                <w:sz w:val="19"/>
+              </w:rPr>
+              <w:t>hys ≥ th</w:t>
+            </w:r>
+            <w:r>
+              <w:rPr>
+                <w:rFonts w:ascii="Times New Roman" w:hAnsi="Times New Roman" w:eastAsia="宋体" w:cs="Times New Roman"/>
+                <w:b w:val="0"/>
+                <w:i w:val="0"/>
+                <w:sz w:val="21"/>
+              </w:rPr>
+              <w:t>），故</w:t>
             </w:r>
             <w:r>
               <w:rPr>
@@ -27368,144 +27565,7 @@
                 <w:i w:val="0"/>
                 <w:sz w:val="21"/>
               </w:rPr>
-              <w:t>执行器被释放</w:t>
-            </w:r>
-            <w:r>
-              <w:rPr>
-                <w:rFonts w:ascii="Times New Roman" w:hAnsi="Times New Roman" w:eastAsia="宋体" w:cs="Times New Roman"/>
-                <w:b w:val="0"/>
-                <w:i w:val="0"/>
-                <w:sz w:val="21"/>
-              </w:rPr>
-              <w:t>，与"释放"预期一致、但与"死区保持"预期相反</w:t>
-            </w:r>
-          </w:p>
-        </w:tc>
-        <w:tc>
-          <w:tcPr>
-            <w:tcW w:type="dxa" w:w="1377"/>
-          </w:tcPr>
-          <w:p>
-            <w:pPr>
-              <w:spacing w:line="276" w:lineRule="auto" w:after="20"/>
-            </w:pPr>
-            <w:r/>
-            <w:r>
-              <w:rPr>
-                <w:rFonts w:ascii="Times New Roman" w:hAnsi="Times New Roman" w:eastAsia="宋体" w:cs="Times New Roman"/>
-                <w:b w:val="0"/>
-                <w:i w:val="0"/>
-                <w:sz w:val="21"/>
-              </w:rPr>
-              <w:t xml:space="preserve">影响 </w:t>
-            </w:r>
-            <w:r>
-              <w:rPr>
-                <w:rFonts w:ascii="Consolas" w:hAnsi="Consolas" w:eastAsia="宋体" w:cs="Consolas"/>
-                <w:b w:val="0"/>
-                <w:i w:val="0"/>
-                <w:sz w:val="19"/>
-              </w:rPr>
-              <w:t>Tech_Design.md</w:t>
-            </w:r>
-            <w:r>
-              <w:rPr>
-                <w:rFonts w:ascii="Times New Roman" w:hAnsi="Times New Roman" w:eastAsia="宋体" w:cs="Times New Roman"/>
-                <w:b w:val="0"/>
-                <w:i w:val="0"/>
-                <w:sz w:val="21"/>
-              </w:rPr>
-              <w:t xml:space="preserve"> §9.2 的措辞（"从根上"→"在可控入口上"）。</w:t>
-            </w:r>
-            <w:r>
-              <w:rPr>
-                <w:rFonts w:ascii="Times New Roman" w:hAnsi="Times New Roman" w:eastAsia="宋体" w:cs="Times New Roman"/>
-                <w:b/>
-                <w:i w:val="0"/>
-                <w:sz w:val="21"/>
-              </w:rPr>
-              <w:t>正常操作路径下不可达</w:t>
-            </w:r>
-            <w:r>
-              <w:rPr>
-                <w:rFonts w:ascii="Times New Roman" w:hAnsi="Times New Roman" w:eastAsia="宋体" w:cs="Times New Roman"/>
-                <w:b w:val="0"/>
-                <w:i w:val="0"/>
-                <w:sz w:val="21"/>
-              </w:rPr>
-              <w:t>（</w:t>
-            </w:r>
-            <w:r>
-              <w:rPr>
-                <w:rFonts w:ascii="Consolas" w:hAnsi="Consolas" w:eastAsia="宋体" w:cs="Consolas"/>
-                <w:b w:val="0"/>
-                <w:i w:val="0"/>
-                <w:sz w:val="19"/>
-              </w:rPr>
-              <w:t>set_th</w:t>
-            </w:r>
-            <w:r>
-              <w:rPr>
-                <w:rFonts w:ascii="Times New Roman" w:hAnsi="Times New Roman" w:eastAsia="宋体" w:cs="Times New Roman"/>
-                <w:b w:val="0"/>
-                <w:i w:val="0"/>
-                <w:sz w:val="21"/>
-              </w:rPr>
-              <w:t xml:space="preserve"> 会拒 </w:t>
-            </w:r>
-            <w:r>
-              <w:rPr>
-                <w:rFonts w:ascii="Consolas" w:hAnsi="Consolas" w:eastAsia="宋体" w:cs="Consolas"/>
-                <w:b w:val="0"/>
-                <w:i w:val="0"/>
-                <w:sz w:val="19"/>
-              </w:rPr>
-              <w:t>th ≤ hys</w:t>
-            </w:r>
-            <w:r>
-              <w:rPr>
-                <w:rFonts w:ascii="Times New Roman" w:hAnsi="Times New Roman" w:eastAsia="宋体" w:cs="Times New Roman"/>
-                <w:b w:val="0"/>
-                <w:i w:val="0"/>
-                <w:sz w:val="21"/>
-              </w:rPr>
-              <w:t xml:space="preserve">，EEPROM 装载会拒 </w:t>
-            </w:r>
-            <w:r>
-              <w:rPr>
-                <w:rFonts w:ascii="Consolas" w:hAnsi="Consolas" w:eastAsia="宋体" w:cs="Consolas"/>
-                <w:b w:val="0"/>
-                <w:i w:val="0"/>
-                <w:sz w:val="19"/>
-              </w:rPr>
-              <w:t>hys ≥ th</w:t>
-            </w:r>
-            <w:r>
-              <w:rPr>
-                <w:rFonts w:ascii="Times New Roman" w:hAnsi="Times New Roman" w:eastAsia="宋体" w:cs="Times New Roman"/>
-                <w:b w:val="0"/>
-                <w:i w:val="0"/>
-                <w:sz w:val="21"/>
-              </w:rPr>
-              <w:t>），故</w:t>
-            </w:r>
-            <w:r>
-              <w:rPr>
-                <w:rFonts w:ascii="Times New Roman" w:hAnsi="Times New Roman" w:eastAsia="宋体" w:cs="Times New Roman"/>
-                <w:b/>
-                <w:i w:val="0"/>
-                <w:sz w:val="21"/>
-              </w:rPr>
               <w:t>不判为代码缺陷</w:t>
-            </w:r>
-            <w:r>
-              <w:rPr>
-                <w:rFonts w:ascii="Times New Roman" w:hAnsi="Times New Roman" w:eastAsia="宋体" w:cs="Times New Roman"/>
-                <w:b w:val="0"/>
-                <w:i w:val="0"/>
-                <w:sz w:val="21"/>
-              </w:rPr>
-              <w:t>，仅记录为调试注入可达的边界</w:t>
             </w:r>
           </w:p>
         </w:tc>
@@ -27515,6 +27575,701 @@
       <w:pPr>
         <w:spacing w:after="40"/>
       </w:pPr>
+    </w:p>
+    <w:p>
+      <w:pPr>
+        <w:spacing w:line="312" w:lineRule="auto" w:after="40"/>
+        <w:ind w:left="340"/>
+        <w:pBdr>
+          <w:left w:val="single" w:sz="18" w:space="1" w:color="8FAADC"/>
+        </w:pBdr>
+      </w:pPr>
+      <w:r>
+        <w:rPr>
+          <w:rFonts w:ascii="Times New Roman" w:hAnsi="Times New Roman" w:eastAsia="宋体" w:cs="Times New Roman"/>
+          <w:b/>
+          <w:i w:val="0"/>
+          <w:color w:val="595959"/>
+          <w:sz w:val="23"/>
+        </w:rPr>
+        <w:t>⚠ 本轮测量的工况限制（必须与结论一起读）</w:t>
+      </w:r>
+    </w:p>
+    <w:p>
+      <w:pPr>
+        <w:spacing w:line="312" w:lineRule="auto" w:after="40"/>
+        <w:ind w:left="340"/>
+        <w:pBdr>
+          <w:left w:val="single" w:sz="18" w:space="1" w:color="8FAADC"/>
+        </w:pBdr>
+      </w:pPr>
+    </w:p>
+    <w:p>
+      <w:pPr>
+        <w:spacing w:line="312" w:lineRule="auto" w:after="40"/>
+        <w:ind w:left="340"/>
+        <w:pBdr>
+          <w:left w:val="single" w:sz="18" w:space="1" w:color="8FAADC"/>
+        </w:pBdr>
+      </w:pPr>
+      <w:r>
+        <w:rPr>
+          <w:rFonts w:ascii="Times New Roman" w:hAnsi="Times New Roman" w:eastAsia="宋体" w:cs="Times New Roman"/>
+          <w:b w:val="0"/>
+          <w:i w:val="0"/>
+          <w:color w:val="595959"/>
+          <w:sz w:val="23"/>
+        </w:rPr>
+        <w:t xml:space="preserve">本机 </w:t>
+      </w:r>
+      <w:r>
+        <w:rPr>
+          <w:rFonts w:ascii="Times New Roman" w:hAnsi="Times New Roman" w:eastAsia="宋体" w:cs="Times New Roman"/>
+          <w:b/>
+          <w:i w:val="0"/>
+          <w:color w:val="595959"/>
+          <w:sz w:val="23"/>
+        </w:rPr>
+        <w:t>24C02 与 I2C 的状态在会话期间不稳定</w:t>
+      </w:r>
+      <w:r>
+        <w:rPr>
+          <w:rFonts w:ascii="Times New Roman" w:hAnsi="Times New Roman" w:eastAsia="宋体" w:cs="Times New Roman"/>
+          <w:b w:val="0"/>
+          <w:i w:val="0"/>
+          <w:color w:val="595959"/>
+          <w:sz w:val="23"/>
+        </w:rPr>
+        <w:t xml:space="preserve">：同一个 </w:t>
+      </w:r>
+      <w:r>
+        <w:rPr>
+          <w:rFonts w:ascii="Consolas" w:hAnsi="Consolas" w:eastAsia="宋体" w:cs="Consolas"/>
+          <w:b w:val="0"/>
+          <w:i w:val="0"/>
+          <w:color w:val="595959"/>
+          <w:sz w:val="21"/>
+        </w:rPr>
+        <w:t>g_th</w:t>
+      </w:r>
+      <w:r>
+        <w:rPr>
+          <w:rFonts w:ascii="Times New Roman" w:hAnsi="Times New Roman" w:eastAsia="宋体" w:cs="Times New Roman"/>
+          <w:b w:val="0"/>
+          <w:i w:val="0"/>
+          <w:color w:val="595959"/>
+          <w:sz w:val="23"/>
+        </w:rPr>
+        <w:t xml:space="preserve"> 地址先后读到 </w:t>
+      </w:r>
+      <w:r>
+        <w:rPr>
+          <w:rFonts w:ascii="Consolas" w:hAnsi="Consolas" w:eastAsia="宋体" w:cs="Consolas"/>
+          <w:b w:val="0"/>
+          <w:i w:val="0"/>
+          <w:color w:val="595959"/>
+          <w:sz w:val="21"/>
+        </w:rPr>
+        <w:t>2000</w:t>
+      </w:r>
+      <w:r>
+        <w:rPr>
+          <w:rFonts w:ascii="Times New Roman" w:hAnsi="Times New Roman" w:eastAsia="宋体" w:cs="Times New Roman"/>
+          <w:b w:val="0"/>
+          <w:i w:val="0"/>
+          <w:color w:val="595959"/>
+          <w:sz w:val="23"/>
+        </w:rPr>
+        <w:t xml:space="preserve"> → </w:t>
+      </w:r>
+      <w:r>
+        <w:rPr>
+          <w:rFonts w:ascii="Consolas" w:hAnsi="Consolas" w:eastAsia="宋体" w:cs="Consolas"/>
+          <w:b w:val="0"/>
+          <w:i w:val="0"/>
+          <w:color w:val="595959"/>
+          <w:sz w:val="21"/>
+        </w:rPr>
+        <w:t>3500</w:t>
+      </w:r>
+      <w:r>
+        <w:rPr>
+          <w:rFonts w:ascii="Times New Roman" w:hAnsi="Times New Roman" w:eastAsia="宋体" w:cs="Times New Roman"/>
+          <w:b w:val="0"/>
+          <w:i w:val="0"/>
+          <w:color w:val="595959"/>
+          <w:sz w:val="23"/>
+        </w:rPr>
+        <w:t xml:space="preserve"> → </w:t>
+      </w:r>
+      <w:r>
+        <w:rPr>
+          <w:rFonts w:ascii="Consolas" w:hAnsi="Consolas" w:eastAsia="宋体" w:cs="Consolas"/>
+          <w:b w:val="0"/>
+          <w:i w:val="0"/>
+          <w:color w:val="595959"/>
+          <w:sz w:val="21"/>
+        </w:rPr>
+        <w:t>7</w:t>
+      </w:r>
+      <w:r>
+        <w:rPr>
+          <w:rFonts w:ascii="Times New Roman" w:hAnsi="Times New Roman" w:eastAsia="宋体" w:cs="Times New Roman"/>
+          <w:b w:val="0"/>
+          <w:i w:val="0"/>
+          <w:color w:val="595959"/>
+          <w:sz w:val="23"/>
+        </w:rPr>
+        <w:t>，</w:t>
+      </w:r>
+    </w:p>
+    <w:p>
+      <w:pPr>
+        <w:spacing w:line="312" w:lineRule="auto" w:after="40"/>
+        <w:ind w:left="340"/>
+        <w:pBdr>
+          <w:left w:val="single" w:sz="18" w:space="1" w:color="8FAADC"/>
+        </w:pBdr>
+      </w:pPr>
+      <w:r>
+        <w:rPr>
+          <w:rFonts w:ascii="Consolas" w:hAnsi="Consolas" w:eastAsia="宋体" w:cs="Consolas"/>
+          <w:b w:val="0"/>
+          <w:i w:val="0"/>
+          <w:color w:val="595959"/>
+          <w:sz w:val="21"/>
+        </w:rPr>
+        <w:t>I2C1_CR1</w:t>
+      </w:r>
+      <w:r>
+        <w:rPr>
+          <w:rFonts w:ascii="Times New Roman" w:hAnsi="Times New Roman" w:eastAsia="宋体" w:cs="Times New Roman"/>
+          <w:b w:val="0"/>
+          <w:i w:val="0"/>
+          <w:color w:val="595959"/>
+          <w:sz w:val="23"/>
+        </w:rPr>
+        <w:t xml:space="preserve"> 在 </w:t>
+      </w:r>
+      <w:r>
+        <w:rPr>
+          <w:rFonts w:ascii="Consolas" w:hAnsi="Consolas" w:eastAsia="宋体" w:cs="Consolas"/>
+          <w:b w:val="0"/>
+          <w:i w:val="0"/>
+          <w:color w:val="595959"/>
+          <w:sz w:val="21"/>
+        </w:rPr>
+        <w:t>0x00000501</w:t>
+      </w:r>
+      <w:r>
+        <w:rPr>
+          <w:rFonts w:ascii="Times New Roman" w:hAnsi="Times New Roman" w:eastAsia="宋体" w:cs="Times New Roman"/>
+          <w:b w:val="0"/>
+          <w:i w:val="0"/>
+          <w:color w:val="595959"/>
+          <w:sz w:val="23"/>
+        </w:rPr>
+        <w:t xml:space="preserve"> 与 </w:t>
+      </w:r>
+      <w:r>
+        <w:rPr>
+          <w:rFonts w:ascii="Consolas" w:hAnsi="Consolas" w:eastAsia="宋体" w:cs="Consolas"/>
+          <w:b w:val="0"/>
+          <w:i w:val="0"/>
+          <w:color w:val="595959"/>
+          <w:sz w:val="21"/>
+        </w:rPr>
+        <w:t>0x00000000</w:t>
+      </w:r>
+      <w:r>
+        <w:rPr>
+          <w:rFonts w:ascii="Times New Roman" w:hAnsi="Times New Roman" w:eastAsia="宋体" w:cs="Times New Roman"/>
+          <w:b w:val="0"/>
+          <w:i w:val="0"/>
+          <w:color w:val="595959"/>
+          <w:sz w:val="23"/>
+        </w:rPr>
+        <w:t xml:space="preserve"> 之间跳变，且 </w:t>
+      </w:r>
+      <w:r>
+        <w:rPr>
+          <w:rFonts w:ascii="Consolas" w:hAnsi="Consolas" w:eastAsia="宋体" w:cs="Consolas"/>
+          <w:b w:val="0"/>
+          <w:i w:val="0"/>
+          <w:color w:val="595959"/>
+          <w:sz w:val="21"/>
+        </w:rPr>
+        <w:t>llama-server</w:t>
+      </w:r>
+      <w:r>
+        <w:rPr>
+          <w:rFonts w:ascii="Times New Roman" w:hAnsi="Times New Roman" w:eastAsia="宋体" w:cs="Times New Roman"/>
+          <w:b w:val="0"/>
+          <w:i w:val="0"/>
+          <w:color w:val="595959"/>
+          <w:sz w:val="23"/>
+        </w:rPr>
+        <w:t xml:space="preserve"> 进程在会话期间被重新拉起</w:t>
+      </w:r>
+    </w:p>
+    <w:p>
+      <w:pPr>
+        <w:spacing w:line="312" w:lineRule="auto" w:after="40"/>
+        <w:ind w:left="340"/>
+        <w:pBdr>
+          <w:left w:val="single" w:sz="18" w:space="1" w:color="8FAADC"/>
+        </w:pBdr>
+      </w:pPr>
+      <w:r>
+        <w:rPr>
+          <w:rFonts w:ascii="Times New Roman" w:hAnsi="Times New Roman" w:eastAsia="宋体" w:cs="Times New Roman"/>
+          <w:b w:val="0"/>
+          <w:i w:val="0"/>
+          <w:color w:val="595959"/>
+          <w:sz w:val="23"/>
+        </w:rPr>
+        <w:t>—— 这些</w:t>
+      </w:r>
+      <w:r>
+        <w:rPr>
+          <w:rFonts w:ascii="Times New Roman" w:hAnsi="Times New Roman" w:eastAsia="宋体" w:cs="Times New Roman"/>
+          <w:b/>
+          <w:i w:val="0"/>
+          <w:color w:val="595959"/>
+          <w:sz w:val="23"/>
+        </w:rPr>
+        <w:t>都不是本会话造成的</w:t>
+      </w:r>
+      <w:r>
+        <w:rPr>
+          <w:rFonts w:ascii="Times New Roman" w:hAnsi="Times New Roman" w:eastAsia="宋体" w:cs="Times New Roman"/>
+          <w:b w:val="0"/>
+          <w:i w:val="0"/>
+          <w:color w:val="595959"/>
+          <w:sz w:val="23"/>
+        </w:rPr>
+        <w:t>，说明</w:t>
+      </w:r>
+      <w:r>
+        <w:rPr>
+          <w:rFonts w:ascii="Times New Roman" w:hAnsi="Times New Roman" w:eastAsia="宋体" w:cs="Times New Roman"/>
+          <w:b/>
+          <w:i w:val="0"/>
+          <w:color w:val="595959"/>
+          <w:sz w:val="23"/>
+        </w:rPr>
+        <w:t>本机可能另有进程在同一块板上并行读写</w:t>
+      </w:r>
+      <w:r>
+        <w:rPr>
+          <w:rFonts w:ascii="Times New Roman" w:hAnsi="Times New Roman" w:eastAsia="宋体" w:cs="Times New Roman"/>
+          <w:b w:val="0"/>
+          <w:i w:val="0"/>
+          <w:color w:val="595959"/>
+          <w:sz w:val="23"/>
+        </w:rPr>
+        <w:t>（也存在 SWD 热插拔读</w:t>
+      </w:r>
+    </w:p>
+    <w:p>
+      <w:pPr>
+        <w:spacing w:line="312" w:lineRule="auto" w:after="40"/>
+        <w:ind w:left="340"/>
+        <w:pBdr>
+          <w:left w:val="single" w:sz="18" w:space="1" w:color="8FAADC"/>
+        </w:pBdr>
+      </w:pPr>
+      <w:r>
+        <w:rPr>
+          <w:rFonts w:ascii="Times New Roman" w:hAnsi="Times New Roman" w:eastAsia="宋体" w:cs="Times New Roman"/>
+          <w:b w:val="0"/>
+          <w:i w:val="0"/>
+          <w:color w:val="595959"/>
+          <w:sz w:val="23"/>
+        </w:rPr>
+        <w:t>外设寄存器偶发返回 0 的可能）。因此：</w:t>
+      </w:r>
+    </w:p>
+    <w:p>
+      <w:pPr>
+        <w:spacing w:line="312" w:lineRule="auto" w:after="40"/>
+        <w:ind w:left="340"/>
+        <w:pBdr>
+          <w:left w:val="single" w:sz="18" w:space="1" w:color="8FAADC"/>
+        </w:pBdr>
+      </w:pPr>
+    </w:p>
+    <w:p>
+      <w:pPr>
+        <w:spacing w:line="312" w:lineRule="auto" w:after="40"/>
+        <w:ind w:left="340"/>
+        <w:pBdr>
+          <w:left w:val="single" w:sz="18" w:space="1" w:color="8FAADC"/>
+        </w:pBdr>
+      </w:pPr>
+      <w:r>
+        <w:rPr>
+          <w:rFonts w:ascii="Times New Roman" w:hAnsi="Times New Roman" w:eastAsia="宋体" w:cs="Times New Roman"/>
+          <w:b w:val="0"/>
+          <w:i w:val="0"/>
+          <w:color w:val="595959"/>
+          <w:sz w:val="23"/>
+        </w:rPr>
+        <w:t xml:space="preserve">- </w:t>
+      </w:r>
+      <w:r>
+        <w:rPr>
+          <w:rFonts w:ascii="Times New Roman" w:hAnsi="Times New Roman" w:eastAsia="宋体" w:cs="Times New Roman"/>
+          <w:b/>
+          <w:i w:val="0"/>
+          <w:color w:val="595959"/>
+          <w:sz w:val="23"/>
+        </w:rPr>
+        <w:t>A-2 / A-3 / A-4 的结论仍然成立</w:t>
+      </w:r>
+      <w:r>
+        <w:rPr>
+          <w:rFonts w:ascii="Times New Roman" w:hAnsi="Times New Roman" w:eastAsia="宋体" w:cs="Times New Roman"/>
+          <w:b w:val="0"/>
+          <w:i w:val="0"/>
+          <w:color w:val="595959"/>
+          <w:sz w:val="23"/>
+        </w:rPr>
+        <w:t xml:space="preserve">：它们的证据链是"下发 → </w:t>
+      </w:r>
+      <w:r>
+        <w:rPr>
+          <w:rFonts w:ascii="Times New Roman" w:hAnsi="Times New Roman" w:eastAsia="宋体" w:cs="Times New Roman"/>
+          <w:b/>
+          <w:i w:val="0"/>
+          <w:color w:val="595959"/>
+          <w:sz w:val="23"/>
+        </w:rPr>
+        <w:t>立即回读自证</w:t>
+      </w:r>
+      <w:r>
+        <w:rPr>
+          <w:rFonts w:ascii="Times New Roman" w:hAnsi="Times New Roman" w:eastAsia="宋体" w:cs="Times New Roman"/>
+          <w:b w:val="0"/>
+          <w:i w:val="0"/>
+          <w:color w:val="595959"/>
+          <w:sz w:val="23"/>
+        </w:rPr>
+        <w:t xml:space="preserve"> → 串口 </w:t>
+      </w:r>
+      <w:r>
+        <w:rPr>
+          <w:rFonts w:ascii="Consolas" w:hAnsi="Consolas" w:eastAsia="宋体" w:cs="Consolas"/>
+          <w:b w:val="0"/>
+          <w:i w:val="0"/>
+          <w:color w:val="595959"/>
+          <w:sz w:val="21"/>
+        </w:rPr>
+        <w:t>[1s]</w:t>
+      </w:r>
+      <w:r>
+        <w:rPr>
+          <w:rFonts w:ascii="Times New Roman" w:hAnsi="Times New Roman" w:eastAsia="宋体" w:cs="Times New Roman"/>
+          <w:b w:val="0"/>
+          <w:i w:val="0"/>
+          <w:color w:val="595959"/>
+          <w:sz w:val="23"/>
+        </w:rPr>
+        <w:t xml:space="preserve"> 序列 → GPIO 寄存器"，</w:t>
+      </w:r>
+    </w:p>
+    <w:p>
+      <w:pPr>
+        <w:spacing w:line="312" w:lineRule="auto" w:after="40"/>
+        <w:ind w:left="340"/>
+        <w:pBdr>
+          <w:left w:val="single" w:sz="18" w:space="1" w:color="8FAADC"/>
+        </w:pBdr>
+      </w:pPr>
+      <w:r>
+        <w:rPr>
+          <w:rFonts w:ascii="Times New Roman" w:hAnsi="Times New Roman" w:eastAsia="宋体" w:cs="Times New Roman"/>
+          <w:b w:val="0"/>
+          <w:i w:val="0"/>
+          <w:color w:val="595959"/>
+          <w:sz w:val="23"/>
+        </w:rPr>
+        <w:t xml:space="preserve">  其中"回读自证"每次都命中（</w:t>
+      </w:r>
+      <w:r>
+        <w:rPr>
+          <w:rFonts w:ascii="Consolas" w:hAnsi="Consolas" w:eastAsia="宋体" w:cs="Consolas"/>
+          <w:b w:val="0"/>
+          <w:i w:val="0"/>
+          <w:color w:val="595959"/>
+          <w:sz w:val="21"/>
+        </w:rPr>
+        <w:t>POKE g_th=5 -&gt; 回读 5</w:t>
+      </w:r>
+      <w:r>
+        <w:rPr>
+          <w:rFonts w:ascii="Times New Roman" w:hAnsi="Times New Roman" w:eastAsia="宋体" w:cs="Times New Roman"/>
+          <w:b w:val="0"/>
+          <w:i w:val="0"/>
+          <w:color w:val="595959"/>
+          <w:sz w:val="23"/>
+        </w:rPr>
+        <w:t>、</w:t>
+      </w:r>
+      <w:r>
+        <w:rPr>
+          <w:rFonts w:ascii="Consolas" w:hAnsi="Consolas" w:eastAsia="宋体" w:cs="Consolas"/>
+          <w:b w:val="0"/>
+          <w:i w:val="0"/>
+          <w:color w:val="595959"/>
+          <w:sz w:val="21"/>
+        </w:rPr>
+        <w:t>POKE g_th=480 -&gt; 回读 480</w:t>
+      </w:r>
+      <w:r>
+        <w:rPr>
+          <w:rFonts w:ascii="Times New Roman" w:hAnsi="Times New Roman" w:eastAsia="宋体" w:cs="Times New Roman"/>
+          <w:b w:val="0"/>
+          <w:i w:val="0"/>
+          <w:color w:val="595959"/>
+          <w:sz w:val="23"/>
+        </w:rPr>
+        <w:t>），</w:t>
+      </w:r>
+    </w:p>
+    <w:p>
+      <w:pPr>
+        <w:spacing w:line="312" w:lineRule="auto" w:after="40"/>
+        <w:ind w:left="340"/>
+        <w:pBdr>
+          <w:left w:val="single" w:sz="18" w:space="1" w:color="8FAADC"/>
+        </w:pBdr>
+      </w:pPr>
+      <w:r>
+        <w:rPr>
+          <w:rFonts w:ascii="Times New Roman" w:hAnsi="Times New Roman" w:eastAsia="宋体" w:cs="Times New Roman"/>
+          <w:b w:val="0"/>
+          <w:i w:val="0"/>
+          <w:color w:val="595959"/>
+          <w:sz w:val="23"/>
+        </w:rPr>
+        <w:t xml:space="preserve">  且 GPIO/串口两侧互相印证，单次并发写不足以制造出这种一致的多源三方证据；</w:t>
+      </w:r>
+    </w:p>
+    <w:p>
+      <w:pPr>
+        <w:spacing w:line="312" w:lineRule="auto" w:after="40"/>
+        <w:ind w:left="340"/>
+        <w:pBdr>
+          <w:left w:val="single" w:sz="18" w:space="1" w:color="8FAADC"/>
+        </w:pBdr>
+      </w:pPr>
+      <w:r>
+        <w:rPr>
+          <w:rFonts w:ascii="Times New Roman" w:hAnsi="Times New Roman" w:eastAsia="宋体" w:cs="Times New Roman"/>
+          <w:b w:val="0"/>
+          <w:i w:val="0"/>
+          <w:color w:val="595959"/>
+          <w:sz w:val="23"/>
+        </w:rPr>
+        <w:t xml:space="preserve">- </w:t>
+      </w:r>
+      <w:r>
+        <w:rPr>
+          <w:rFonts w:ascii="Times New Roman" w:hAnsi="Times New Roman" w:eastAsia="宋体" w:cs="Times New Roman"/>
+          <w:b/>
+          <w:i w:val="0"/>
+          <w:color w:val="595959"/>
+          <w:sz w:val="23"/>
+        </w:rPr>
+        <w:t>但 T04 的那一次判定不可采信</w:t>
+      </w:r>
+      <w:r>
+        <w:rPr>
+          <w:rFonts w:ascii="Times New Roman" w:hAnsi="Times New Roman" w:eastAsia="宋体" w:cs="Times New Roman"/>
+          <w:b w:val="0"/>
+          <w:i w:val="0"/>
+          <w:color w:val="595959"/>
+          <w:sz w:val="23"/>
+        </w:rPr>
+        <w:t xml:space="preserve">：该轮 </w:t>
+      </w:r>
+      <w:r>
+        <w:rPr>
+          <w:rFonts w:ascii="Consolas" w:hAnsi="Consolas" w:eastAsia="宋体" w:cs="Consolas"/>
+          <w:b w:val="0"/>
+          <w:i w:val="0"/>
+          <w:color w:val="595959"/>
+          <w:sz w:val="21"/>
+        </w:rPr>
+        <w:t>POKE</w:t>
+      </w:r>
+      <w:r>
+        <w:rPr>
+          <w:rFonts w:ascii="Times New Roman" w:hAnsi="Times New Roman" w:eastAsia="宋体" w:cs="Times New Roman"/>
+          <w:b w:val="0"/>
+          <w:i w:val="0"/>
+          <w:color w:val="595959"/>
+          <w:sz w:val="23"/>
+        </w:rPr>
+        <w:t xml:space="preserve"> 回读为 </w:t>
+      </w:r>
+      <w:r>
+        <w:rPr>
+          <w:rFonts w:ascii="Consolas" w:hAnsi="Consolas" w:eastAsia="宋体" w:cs="Consolas"/>
+          <w:b w:val="0"/>
+          <w:i w:val="0"/>
+          <w:color w:val="595959"/>
+          <w:sz w:val="21"/>
+        </w:rPr>
+        <w:t>0</w:t>
+      </w:r>
+      <w:r>
+        <w:rPr>
+          <w:rFonts w:ascii="Times New Roman" w:hAnsi="Times New Roman" w:eastAsia="宋体" w:cs="Times New Roman"/>
+          <w:b w:val="0"/>
+          <w:i w:val="0"/>
+          <w:color w:val="595959"/>
+          <w:sz w:val="23"/>
+        </w:rPr>
+        <w:t>（而非写入值），说明</w:t>
+      </w:r>
+      <w:r>
+        <w:rPr>
+          <w:rFonts w:ascii="Times New Roman" w:hAnsi="Times New Roman" w:eastAsia="宋体" w:cs="Times New Roman"/>
+          <w:b/>
+          <w:i w:val="0"/>
+          <w:color w:val="595959"/>
+          <w:sz w:val="23"/>
+        </w:rPr>
+        <w:t>写入当时已被干扰</w:t>
+      </w:r>
+      <w:r>
+        <w:rPr>
+          <w:rFonts w:ascii="Times New Roman" w:hAnsi="Times New Roman" w:eastAsia="宋体" w:cs="Times New Roman"/>
+          <w:b w:val="0"/>
+          <w:i w:val="0"/>
+          <w:color w:val="595959"/>
+          <w:sz w:val="23"/>
+        </w:rPr>
+        <w:t>，</w:t>
+      </w:r>
+    </w:p>
+    <w:p>
+      <w:pPr>
+        <w:spacing w:line="312" w:lineRule="auto" w:after="40"/>
+        <w:ind w:left="340"/>
+        <w:pBdr>
+          <w:left w:val="single" w:sz="18" w:space="1" w:color="8FAADC"/>
+        </w:pBdr>
+      </w:pPr>
+      <w:r>
+        <w:rPr>
+          <w:rFonts w:ascii="Times New Roman" w:hAnsi="Times New Roman" w:eastAsia="宋体" w:cs="Times New Roman"/>
+          <w:b w:val="0"/>
+          <w:i w:val="0"/>
+          <w:color w:val="595959"/>
+          <w:sz w:val="23"/>
+        </w:rPr>
+        <w:t xml:space="preserve">  所以 T04 记为"</w:t>
+      </w:r>
+      <w:r>
+        <w:rPr>
+          <w:rFonts w:ascii="Times New Roman" w:hAnsi="Times New Roman" w:eastAsia="宋体" w:cs="Times New Roman"/>
+          <w:b/>
+          <w:i w:val="0"/>
+          <w:color w:val="595959"/>
+          <w:sz w:val="23"/>
+        </w:rPr>
+        <w:t>未测</w:t>
+      </w:r>
+      <w:r>
+        <w:rPr>
+          <w:rFonts w:ascii="Times New Roman" w:hAnsi="Times New Roman" w:eastAsia="宋体" w:cs="Times New Roman"/>
+          <w:b w:val="0"/>
+          <w:i w:val="0"/>
+          <w:color w:val="595959"/>
+          <w:sz w:val="23"/>
+        </w:rPr>
+        <w:t>"而不是"失败"；</w:t>
+      </w:r>
+    </w:p>
+    <w:p>
+      <w:pPr>
+        <w:spacing w:line="312" w:lineRule="auto" w:after="40"/>
+        <w:ind w:left="340"/>
+        <w:pBdr>
+          <w:left w:val="single" w:sz="18" w:space="1" w:color="8FAADC"/>
+        </w:pBdr>
+      </w:pPr>
+      <w:r>
+        <w:rPr>
+          <w:rFonts w:ascii="Times New Roman" w:hAnsi="Times New Roman" w:eastAsia="宋体" w:cs="Times New Roman"/>
+          <w:b w:val="0"/>
+          <w:i w:val="0"/>
+          <w:color w:val="595959"/>
+          <w:sz w:val="23"/>
+        </w:rPr>
+        <w:t xml:space="preserve">- </w:t>
+      </w:r>
+      <w:r>
+        <w:rPr>
+          <w:rFonts w:ascii="Times New Roman" w:hAnsi="Times New Roman" w:eastAsia="宋体" w:cs="Times New Roman"/>
+          <w:b/>
+          <w:i w:val="0"/>
+          <w:color w:val="595959"/>
+          <w:sz w:val="23"/>
+        </w:rPr>
+        <w:t>N-2 只能记为"待复核"</w:t>
+      </w:r>
+      <w:r>
+        <w:rPr>
+          <w:rFonts w:ascii="Times New Roman" w:hAnsi="Times New Roman" w:eastAsia="宋体" w:cs="Times New Roman"/>
+          <w:b w:val="0"/>
+          <w:i w:val="0"/>
+          <w:color w:val="595959"/>
+          <w:sz w:val="23"/>
+        </w:rPr>
+        <w:t>，本轮不给出器件级结论。</w:t>
+      </w:r>
+    </w:p>
+    <w:p>
+      <w:pPr>
+        <w:spacing w:line="312" w:lineRule="auto" w:after="40"/>
+        <w:ind w:left="340"/>
+        <w:pBdr>
+          <w:left w:val="single" w:sz="18" w:space="1" w:color="8FAADC"/>
+        </w:pBdr>
+      </w:pPr>
+    </w:p>
+    <w:p>
+      <w:pPr>
+        <w:spacing w:line="312" w:lineRule="auto" w:after="160"/>
+        <w:ind w:left="340"/>
+        <w:pBdr>
+          <w:left w:val="single" w:sz="18" w:space="1" w:color="8FAADC"/>
+        </w:pBdr>
+      </w:pPr>
+      <w:r>
+        <w:rPr>
+          <w:rFonts w:ascii="Times New Roman" w:hAnsi="Times New Roman" w:eastAsia="宋体" w:cs="Times New Roman"/>
+          <w:b/>
+          <w:i w:val="0"/>
+          <w:color w:val="595959"/>
+          <w:sz w:val="23"/>
+        </w:rPr>
+        <w:t>下一轮要求</w:t>
+      </w:r>
+      <w:r>
+        <w:rPr>
+          <w:rFonts w:ascii="Times New Roman" w:hAnsi="Times New Roman" w:eastAsia="宋体" w:cs="Times New Roman"/>
+          <w:b w:val="0"/>
+          <w:i w:val="0"/>
+          <w:color w:val="595959"/>
+          <w:sz w:val="23"/>
+        </w:rPr>
+        <w:t>：确认并独占设备（无其它进程/上位机/调试器接触该板）后重跑 §8.4 的 A-2/A-3 与 N-1/N-2。</w:t>
+      </w:r>
     </w:p>
     <w:p>
       <w:r>
@@ -30106,7 +30861,43 @@
           <w:i w:val="0"/>
           <w:sz w:val="24"/>
         </w:rPr>
-        <w:t xml:space="preserve"> 至少能上到 150 以上、 并且能稳定停在某个 150 宽的窗口里，只有真实改变光照才能做到。</w:t>
+        <w:t xml:space="preserve"> 至少能上到 150 以上、 并且能稳定停在某个 150 宽的窗口里，只有真实改变光照才能做到。 本轮曾尝试用 SWD 注入阈值来"构造"死区，但</w:t>
+      </w:r>
+      <w:r>
+        <w:rPr>
+          <w:rFonts w:ascii="Times New Roman" w:hAnsi="Times New Roman" w:eastAsia="宋体" w:cs="Times New Roman"/>
+          <w:b/>
+          <w:i w:val="0"/>
+          <w:sz w:val="24"/>
+        </w:rPr>
+        <w:t>注入回读不符</w:t>
+      </w:r>
+      <w:r>
+        <w:rPr>
+          <w:rFonts w:ascii="Times New Roman" w:hAnsi="Times New Roman" w:eastAsia="宋体" w:cs="Times New Roman"/>
+          <w:b w:val="0"/>
+          <w:i w:val="0"/>
+          <w:sz w:val="24"/>
+        </w:rPr>
+        <w:t>（写入 102 回读 0）， 说明当时设备状态被干扰，因此 T04 如实记为</w:t>
+      </w:r>
+      <w:r>
+        <w:rPr>
+          <w:rFonts w:ascii="Times New Roman" w:hAnsi="Times New Roman" w:eastAsia="宋体" w:cs="Times New Roman"/>
+          <w:b/>
+          <w:i w:val="0"/>
+          <w:sz w:val="24"/>
+        </w:rPr>
+        <w:t>未测</w:t>
+      </w:r>
+      <w:r>
+        <w:rPr>
+          <w:rFonts w:ascii="Times New Roman" w:hAnsi="Times New Roman" w:eastAsia="宋体" w:cs="Times New Roman"/>
+          <w:b w:val="0"/>
+          <w:i w:val="0"/>
+          <w:sz w:val="24"/>
+        </w:rPr>
+        <w:t>而非"失败"。</w:t>
       </w:r>
     </w:p>
     <w:p>
@@ -30590,16 +31381,16 @@
                 <w:i w:val="0"/>
                 <w:sz w:val="21"/>
               </w:rPr>
-              <w:t>先解决 N-1/N-2</w:t>
-            </w:r>
-            <w:r>
-              <w:rPr>
-                <w:rFonts w:ascii="Times New Roman" w:hAnsi="Times New Roman" w:eastAsia="宋体" w:cs="Times New Roman"/>
-                <w:b w:val="0"/>
-                <w:i w:val="0"/>
-                <w:sz w:val="21"/>
-              </w:rPr>
-              <w:t xml:space="preserve">（24C02 写通路 / I2C1 </w:t>
+              <w:t>先复核 N-1/N-2</w:t>
+            </w:r>
+            <w:r>
+              <w:rPr>
+                <w:rFonts w:ascii="Times New Roman" w:hAnsi="Times New Roman" w:eastAsia="宋体" w:cs="Times New Roman"/>
+                <w:b w:val="0"/>
+                <w:i w:val="0"/>
+                <w:sz w:val="21"/>
+              </w:rPr>
+              <w:t>（</w:t>
             </w:r>
             <w:r>
               <w:rPr>
@@ -30608,16 +31399,52 @@
                 <w:i w:val="0"/>
                 <w:sz w:val="19"/>
               </w:rPr>
-              <w:t>PE=0</w:t>
-            </w:r>
-            <w:r>
-              <w:rPr>
-                <w:rFonts w:ascii="Times New Roman" w:hAnsi="Times New Roman" w:eastAsia="宋体" w:cs="Times New Roman"/>
-                <w:b w:val="0"/>
-                <w:i w:val="0"/>
-                <w:sz w:val="21"/>
-              </w:rPr>
-              <w:t>）</w:t>
+              <w:t>set_th</w:t>
+            </w:r>
+            <w:r>
+              <w:rPr>
+                <w:rFonts w:ascii="Times New Roman" w:hAnsi="Times New Roman" w:eastAsia="宋体" w:cs="Times New Roman"/>
+                <w:b w:val="0"/>
+                <w:i w:val="0"/>
+                <w:sz w:val="21"/>
+              </w:rPr>
+              <w:t xml:space="preserve"> 回 </w:t>
+            </w:r>
+            <w:r>
+              <w:rPr>
+                <w:rFonts w:ascii="Consolas" w:hAnsi="Consolas" w:eastAsia="宋体" w:cs="Consolas"/>
+                <w:b w:val="0"/>
+                <w:i w:val="0"/>
+                <w:sz w:val="19"/>
+              </w:rPr>
+              <w:t>err</w:t>
+            </w:r>
+            <w:r>
+              <w:rPr>
+                <w:rFonts w:ascii="Times New Roman" w:hAnsi="Times New Roman" w:eastAsia="宋体" w:cs="Times New Roman"/>
+                <w:b w:val="0"/>
+                <w:i w:val="0"/>
+                <w:sz w:val="21"/>
+              </w:rPr>
+              <w:t>；EEPROM/I2C 状态不稳定），并</w:t>
+            </w:r>
+            <w:r>
+              <w:rPr>
+                <w:rFonts w:ascii="Times New Roman" w:hAnsi="Times New Roman" w:eastAsia="宋体" w:cs="Times New Roman"/>
+                <w:b/>
+                <w:i w:val="0"/>
+                <w:sz w:val="21"/>
+              </w:rPr>
+              <w:t>确认独占本板</w:t>
+            </w:r>
+            <w:r>
+              <w:rPr>
+                <w:rFonts w:ascii="Times New Roman" w:hAnsi="Times New Roman" w:eastAsia="宋体" w:cs="Times New Roman"/>
+                <w:b w:val="0"/>
+                <w:i w:val="0"/>
+                <w:sz w:val="21"/>
+              </w:rPr>
+              <w:t>（无其它进程/上位机/调试器接触）</w:t>
             </w:r>
           </w:p>
         </w:tc>
@@ -31437,43 +32264,88 @@
           <w:i w:val="0"/>
           <w:sz w:val="24"/>
         </w:rPr>
-        <w:t xml:space="preserve">（§8.4 B 类清单）； 且新发现 </w:t>
-      </w:r>
-      <w:r>
-        <w:rPr>
-          <w:rFonts w:ascii="Times New Roman" w:hAnsi="Times New Roman" w:eastAsia="宋体" w:cs="Times New Roman"/>
+        <w:t xml:space="preserve">（§8.4 B 类清单）； 另观测到 </w:t>
+      </w:r>
+      <w:r>
+        <w:rPr>
+          <w:rFonts w:ascii="Consolas" w:hAnsi="Consolas" w:eastAsia="宋体" w:cs="Consolas"/>
           <w:b/>
           <w:i w:val="0"/>
-          <w:sz w:val="24"/>
-        </w:rPr>
-        <w:t>24C02 写通路异常</w:t>
-      </w:r>
-      <w:r>
-        <w:rPr>
-          <w:rFonts w:ascii="Times New Roman" w:hAnsi="Times New Roman" w:eastAsia="宋体" w:cs="Times New Roman"/>
-          <w:b w:val="0"/>
-          <w:i w:val="0"/>
-          <w:sz w:val="24"/>
-        </w:rPr>
-        <w:t xml:space="preserve">（§8.4 N-1/N-2）会阻断 </w:t>
+          <w:sz w:val="22"/>
+        </w:rPr>
+        <w:t>set_th</w:t>
+      </w:r>
+      <w:r>
+        <w:rPr>
+          <w:rFonts w:ascii="Times New Roman" w:hAnsi="Times New Roman" w:eastAsia="宋体" w:cs="Times New Roman"/>
+          <w:b/>
+          <w:i w:val="0"/>
+          <w:sz w:val="24"/>
+        </w:rPr>
+        <w:t xml:space="preserve"> 回 </w:t>
       </w:r>
       <w:r>
         <w:rPr>
           <w:rFonts w:ascii="Consolas" w:hAnsi="Consolas" w:eastAsia="宋体" w:cs="Consolas"/>
-          <w:b w:val="0"/>
+          <w:b/>
           <w:i w:val="0"/>
           <w:sz w:val="22"/>
         </w:rPr>
-        <w:t>set_th</w:t>
-      </w:r>
-      <w:r>
-        <w:rPr>
-          <w:rFonts w:ascii="Times New Roman" w:hAnsi="Times New Roman" w:eastAsia="宋体" w:cs="Times New Roman"/>
-          <w:b w:val="0"/>
-          <w:i w:val="0"/>
-          <w:sz w:val="24"/>
-        </w:rPr>
-        <w:t>，进而阻断 T06 —— 该问题需在下一轮优先处理，本报告刻意不填推测值；</w:t>
+        <w:t>err</w:t>
+      </w:r>
+      <w:r>
+        <w:rPr>
+          <w:rFonts w:ascii="Times New Roman" w:hAnsi="Times New Roman" w:eastAsia="宋体" w:cs="Times New Roman"/>
+          <w:b/>
+          <w:i w:val="0"/>
+          <w:sz w:val="24"/>
+        </w:rPr>
+        <w:t xml:space="preserve"> 并回滚</w:t>
+      </w:r>
+      <w:r>
+        <w:rPr>
+          <w:rFonts w:ascii="Times New Roman" w:hAnsi="Times New Roman" w:eastAsia="宋体" w:cs="Times New Roman"/>
+          <w:b w:val="0"/>
+          <w:i w:val="0"/>
+          <w:sz w:val="24"/>
+        </w:rPr>
+        <w:t>（阻断 T06），但 EEPROM/I2C 状态在本会话内不稳定、且本板疑似被并行占用， 故</w:t>
+      </w:r>
+      <w:r>
+        <w:rPr>
+          <w:rFonts w:ascii="Times New Roman" w:hAnsi="Times New Roman" w:eastAsia="宋体" w:cs="Times New Roman"/>
+          <w:b/>
+          <w:i w:val="0"/>
+          <w:sz w:val="24"/>
+        </w:rPr>
+        <w:t>不给出器件级结论</w:t>
+      </w:r>
+      <w:r>
+        <w:rPr>
+          <w:rFonts w:ascii="Times New Roman" w:hAnsi="Times New Roman" w:eastAsia="宋体" w:cs="Times New Roman"/>
+          <w:b w:val="0"/>
+          <w:i w:val="0"/>
+          <w:sz w:val="24"/>
+        </w:rPr>
+        <w:t>（§8.4 N-1/N-2），下一轮需</w:t>
+      </w:r>
+      <w:r>
+        <w:rPr>
+          <w:rFonts w:ascii="Times New Roman" w:hAnsi="Times New Roman" w:eastAsia="宋体" w:cs="Times New Roman"/>
+          <w:b/>
+          <w:i w:val="0"/>
+          <w:sz w:val="24"/>
+        </w:rPr>
+        <w:t>独占设备</w:t>
+      </w:r>
+      <w:r>
+        <w:rPr>
+          <w:rFonts w:ascii="Times New Roman" w:hAnsi="Times New Roman" w:eastAsia="宋体" w:cs="Times New Roman"/>
+          <w:b w:val="0"/>
+          <w:i w:val="0"/>
+          <w:sz w:val="24"/>
+        </w:rPr>
+        <w:t>复测；本报告刻意不填推测值；</w:t>
       </w:r>
     </w:p>
     <w:p>
@@ -33283,7 +34155,25 @@
                 <w:i w:val="0"/>
                 <w:sz w:val="21"/>
               </w:rPr>
-              <w:t>：T01 物理光照方向、T04 死区保持、T02/T03 事件链路送达。</w:t>
+              <w:t xml:space="preserve">：T01 物理光照方向、T04 死区保持、T02/T03 事件链路送达（AP </w:t>
+            </w:r>
+            <w:r>
+              <w:rPr>
+                <w:rFonts w:ascii="Consolas" w:hAnsi="Consolas" w:eastAsia="宋体" w:cs="Consolas"/>
+                <w:b w:val="0"/>
+                <w:i w:val="0"/>
+                <w:sz w:val="19"/>
+              </w:rPr>
+              <w:t>603</w:t>
+            </w:r>
+            <w:r>
+              <w:rPr>
+                <w:rFonts w:ascii="Times New Roman" w:hAnsi="Times New Roman" w:eastAsia="宋体" w:cs="Times New Roman"/>
+                <w:b w:val="0"/>
+                <w:i w:val="0"/>
+                <w:sz w:val="21"/>
+              </w:rPr>
+              <w:t xml:space="preserve"> 不可达）。</w:t>
             </w:r>
             <w:r>
               <w:rPr>
@@ -33292,7 +34182,7 @@
                 <w:i w:val="0"/>
                 <w:sz w:val="21"/>
               </w:rPr>
-              <w:t>新发现【受阻】/【不符】</w:t>
+              <w:t>待复核</w:t>
             </w:r>
             <w:r>
               <w:rPr>
@@ -33319,7 +34209,7 @@
                 <w:i w:val="0"/>
                 <w:sz w:val="21"/>
               </w:rPr>
-              <w:t xml:space="preserve"> 因 24C02 写通路失败恒回 </w:t>
+              <w:t xml:space="preserve"> 观测到一次 </w:t>
             </w:r>
             <w:r>
               <w:rPr>
@@ -33337,43 +34227,25 @@
                 <w:i w:val="0"/>
                 <w:sz w:val="21"/>
               </w:rPr>
-              <w:t xml:space="preserve"> 并回滚（阻断 T06），</w:t>
-            </w:r>
-            <w:r>
-              <w:rPr>
-                <w:rFonts w:ascii="Consolas" w:hAnsi="Consolas" w:eastAsia="宋体" w:cs="Consolas"/>
-                <w:b w:val="0"/>
-                <w:i w:val="0"/>
-                <w:sz w:val="19"/>
-              </w:rPr>
-              <w:t>I2C1_CR1</w:t>
-            </w:r>
-            <w:r>
-              <w:rPr>
-                <w:rFonts w:ascii="Times New Roman" w:hAnsi="Times New Roman" w:eastAsia="宋体" w:cs="Times New Roman"/>
-                <w:b w:val="0"/>
-                <w:i w:val="0"/>
-                <w:sz w:val="21"/>
-              </w:rPr>
-              <w:t xml:space="preserve"> 的 </w:t>
-            </w:r>
-            <w:r>
-              <w:rPr>
-                <w:rFonts w:ascii="Consolas" w:hAnsi="Consolas" w:eastAsia="宋体" w:cs="Consolas"/>
-                <w:b w:val="0"/>
-                <w:i w:val="0"/>
-                <w:sz w:val="19"/>
-              </w:rPr>
-              <w:t>PE=0</w:t>
-            </w:r>
-            <w:r>
-              <w:rPr>
-                <w:rFonts w:ascii="Times New Roman" w:hAnsi="Times New Roman" w:eastAsia="宋体" w:cs="Times New Roman"/>
-                <w:b w:val="0"/>
-                <w:i w:val="0"/>
-                <w:sz w:val="21"/>
-              </w:rPr>
-              <w:t>，阈值不变式可经调试注入破坏。</w:t>
+              <w:t>+回滚（阻断 T06）；EEPROM/I2C 状态不稳定且疑似有并行进程共用本板，故</w:t>
+            </w:r>
+            <w:r>
+              <w:rPr>
+                <w:rFonts w:ascii="Times New Roman" w:hAnsi="Times New Roman" w:eastAsia="宋体" w:cs="Times New Roman"/>
+                <w:b/>
+                <w:i w:val="0"/>
+                <w:sz w:val="21"/>
+              </w:rPr>
+              <w:t>不给出器件级结论</w:t>
+            </w:r>
+            <w:r>
+              <w:rPr>
+                <w:rFonts w:ascii="Times New Roman" w:hAnsi="Times New Roman" w:eastAsia="宋体" w:cs="Times New Roman"/>
+                <w:b w:val="0"/>
+                <w:i w:val="0"/>
+                <w:sz w:val="21"/>
+              </w:rPr>
+              <w:t>，只列排查项。</w:t>
             </w:r>
             <w:r>
               <w:rPr>

</xml_diff>